<commit_message>
feat: upgrade verification page to 3-column DOB template with UFC Notion enrichment
- Upgrade verification page template to 3 columns: Full Name, Role, Date of Birth
- Replace hardcoded case code slot with dynamic {CASE CODE} placeholder
- Support natural name wrapping at 11pt for 1-4 participants; apply gentle 9.5pt compaction for 5-6 participants
- Auto-enrich missing UFC participant dates of birth from Notion Participant DB into web review table
- Audit and flag DOB discrepancies between lab PDF reports and Notion participant records
- Add CaseType.ISSUE fallback with dynamic Save & Approve locking until manually classified
- Add Manifest export lock modal when unverified cases exist in batch
- Harmonize Manifest fetch and refresh buttons, and remove deprecated fallback report type card
- Add comprehensive automated unit and integration tests (101/101 passing)
</commit_message>
<xml_diff>
--- a/verification page template.docx
+++ b/verification page template.docx
@@ -1,6 +1,6 @@
 
 <file path=word/document.xml><?xml version="1.0" encoding="utf-8"?>
-<w:document xmlns:wpc="http://schemas.microsoft.com/office/word/2010/wordprocessingCanvas" xmlns:cx="http://schemas.microsoft.com/office/drawing/2014/chartex" xmlns:cx1="http://schemas.microsoft.com/office/drawing/2015/9/8/chartex" xmlns:cx2="http://schemas.microsoft.com/office/drawing/2015/10/21/chartex" xmlns:cx3="http://schemas.microsoft.com/office/drawing/2016/5/9/chartex" xmlns:cx4="http://schemas.microsoft.com/office/drawing/2016/5/10/chartex" xmlns:cx5="http://schemas.microsoft.com/office/drawing/2016/5/11/chartex" xmlns:cx6="http://schemas.microsoft.com/office/drawing/2016/5/12/chartex" xmlns:cx7="http://schemas.microsoft.com/office/drawing/2016/5/13/chartex" xmlns:cx8="http://schemas.microsoft.com/office/drawing/2016/5/14/chartex" xmlns:mc="http://schemas.openxmlformats.org/markup-compatibility/2006" xmlns:m="http://schemas.openxmlformats.org/officeDocument/2006/math" xmlns:aink="http://schemas.microsoft.com/office/drawing/2016/ink" xmlns:am3d="http://schemas.microsoft.com/office/drawing/2017/model3d" xmlns:oel="http://schemas.microsoft.com/office/2019/extlst" xmlns:r="http://schemas.openxmlformats.org/officeDocument/2006/relationships" xmlns:wp14="http://schemas.microsoft.com/office/word/2010/wordprocessingDrawing" xmlns:wp="http://schemas.openxmlformats.org/drawingml/2006/wordprocessingDrawing" xmlns:wpg="http://schemas.microsoft.com/office/word/2010/wordprocessingGroup" xmlns:wpi="http://schemas.microsoft.com/office/word/2010/wordprocessingInk" xmlns:wps="http://schemas.microsoft.com/office/word/2010/wordprocessingShape" xmlns:o="urn:schemas-microsoft-com:office:office" xmlns:v="urn:schemas-microsoft-com:vml" xmlns:w10="urn:schemas-microsoft-com:office:word" xmlns:w="http://schemas.openxmlformats.org/wordprocessingml/2006/main" xmlns:w14="http://schemas.microsoft.com/office/word/2010/wordml" xmlns:w15="http://schemas.microsoft.com/office/word/2012/wordml" xmlns:w16cex="http://schemas.microsoft.com/office/word/2018/wordml/cex" xmlns:w16cid="http://schemas.microsoft.com/office/word/2016/wordml/cid" xmlns:w16="http://schemas.microsoft.com/office/word/2018/wordml" xmlns:w16sdtdh="http://schemas.microsoft.com/office/word/2020/wordml/sdtdatahash" xmlns:w16sdtfl="http://schemas.microsoft.com/office/word/2024/wordml/sdtformatlock" xmlns:w16se="http://schemas.microsoft.com/office/word/2015/wordml/symex" xmlns:w16du="http://schemas.microsoft.com/office/word/2023/wordml/word16du" xmlns:wne="http://schemas.microsoft.com/office/word/2006/wordml" mc:Ignorable="w14 w15 w16se w16cid w16 w16cex w16sdtdh w16sdtfl w16du wp14">
+<w:document xmlns:wpc="http://schemas.microsoft.com/office/word/2010/wordprocessingCanvas" xmlns:cx="http://schemas.microsoft.com/office/drawing/2014/chartex" xmlns:cx1="http://schemas.microsoft.com/office/drawing/2015/9/8/chartex" xmlns:mc="http://schemas.openxmlformats.org/markup-compatibility/2006" xmlns:o="urn:schemas-microsoft-com:office:office" xmlns:r="http://schemas.openxmlformats.org/officeDocument/2006/relationships" xmlns:m="http://schemas.openxmlformats.org/officeDocument/2006/math" xmlns:v="urn:schemas-microsoft-com:vml" xmlns:wp14="http://schemas.microsoft.com/office/word/2010/wordprocessingDrawing" xmlns:wp="http://schemas.openxmlformats.org/drawingml/2006/wordprocessingDrawing" xmlns:w10="urn:schemas-microsoft-com:office:word" xmlns:w="http://schemas.openxmlformats.org/wordprocessingml/2006/main" xmlns:w14="http://schemas.microsoft.com/office/word/2010/wordml" xmlns:w15="http://schemas.microsoft.com/office/word/2012/wordml" xmlns:w16se="http://schemas.microsoft.com/office/word/2015/wordml/symex" xmlns:wpg="http://schemas.microsoft.com/office/word/2010/wordprocessingGroup" xmlns:wpi="http://schemas.microsoft.com/office/word/2010/wordprocessingInk" xmlns:wne="http://schemas.microsoft.com/office/word/2006/wordml" xmlns:wps="http://schemas.microsoft.com/office/word/2010/wordprocessingShape" mc:Ignorable="w14 w15 w16se wp14">
   <w:body>
     <w:tbl>
       <w:tblPr>
@@ -37,6 +37,9 @@
           </w:tcPr>
           <w:p>
             <w:pPr>
+              <w:tabs>
+                <w:tab w:val="left" w:pos="450"/>
+              </w:tabs>
               <w:ind w:left="270"/>
               <w:rPr>
                 <w:rFonts w:ascii="Arial" w:hAnsi="Arial" w:cs="Arial"/>
@@ -50,16 +53,16 @@
                 <w:color w:val="000000" w:themeColor="text1"/>
               </w:rPr>
               <w:drawing>
-                <wp:anchor distT="0" distB="0" distL="114300" distR="114300" simplePos="0" relativeHeight="251658240" behindDoc="0" locked="0" layoutInCell="1" allowOverlap="1" wp14:anchorId="5D898FD9" wp14:editId="01605858">
+                <wp:anchor distT="0" distB="0" distL="114300" distR="114300" simplePos="0" relativeHeight="251658240" behindDoc="0" locked="0" layoutInCell="1" allowOverlap="1">
                   <wp:simplePos x="0" y="0"/>
                   <wp:positionH relativeFrom="column">
-                    <wp:posOffset>-141605</wp:posOffset>
+                    <wp:posOffset>-2685415</wp:posOffset>
                   </wp:positionH>
                   <wp:positionV relativeFrom="paragraph">
-                    <wp:posOffset>-707390</wp:posOffset>
+                    <wp:posOffset>-6350</wp:posOffset>
                   </wp:positionV>
-                  <wp:extent cx="2929890" cy="696595"/>
-                  <wp:effectExtent l="0" t="0" r="3810" b="8255"/>
+                  <wp:extent cx="2574925" cy="612140"/>
+                  <wp:effectExtent l="0" t="0" r="0" b="0"/>
                   <wp:wrapSquare wrapText="bothSides"/>
                   <wp:docPr id="1" name="Picture 1"/>
                   <wp:cNvGraphicFramePr>
@@ -90,7 +93,7 @@
                         <pic:spPr bwMode="auto">
                           <a:xfrm>
                             <a:off x="0" y="0"/>
-                            <a:ext cx="2929890" cy="696595"/>
+                            <a:ext cx="2574925" cy="612140"/>
                           </a:xfrm>
                           <a:prstGeom prst="rect">
                             <a:avLst/>
@@ -123,11 +126,15 @@
           </w:tcPr>
           <w:p>
             <w:pPr>
+              <w:tabs>
+                <w:tab w:val="left" w:pos="450"/>
+              </w:tabs>
               <w:ind w:left="270"/>
               <w:jc w:val="right"/>
               <w:rPr>
                 <w:rFonts w:ascii="Arial" w:hAnsi="Arial" w:cs="Arial"/>
                 <w:color w:val="000000" w:themeColor="text1"/>
+                <w:sz w:val="22"/>
               </w:rPr>
             </w:pPr>
             <w:r>
@@ -136,6 +143,7 @@
                 <w:b/>
                 <w:bCs/>
                 <w:color w:val="000000" w:themeColor="text1"/>
+                <w:sz w:val="22"/>
               </w:rPr>
               <w:t>Case Reference</w:t>
             </w:r>
@@ -144,6 +152,7 @@
                 <w:rFonts w:ascii="Arial" w:hAnsi="Arial" w:cs="Arial"/>
                 <w:bCs/>
                 <w:color w:val="000000" w:themeColor="text1"/>
+                <w:sz w:val="22"/>
               </w:rPr>
               <w:t xml:space="preserve">: </w:t>
             </w:r>
@@ -151,6 +160,7 @@
               <w:rPr>
                 <w:rFonts w:ascii="Arial" w:hAnsi="Arial" w:cs="Arial"/>
                 <w:color w:val="000000" w:themeColor="text1"/>
+                <w:sz w:val="22"/>
               </w:rPr>
               <w:t>{CASE CODE}</w:t>
             </w:r>
@@ -160,6 +170,9 @@
     </w:tbl>
     <w:p>
       <w:pPr>
+        <w:tabs>
+          <w:tab w:val="left" w:pos="450"/>
+        </w:tabs>
         <w:spacing w:before="180" w:after="20"/>
         <w:ind w:left="270"/>
         <w:jc w:val="center"/>
@@ -167,6 +180,7 @@
           <w:rFonts w:ascii="Arial" w:hAnsi="Arial" w:cs="Arial"/>
           <w:b/>
           <w:color w:val="000000" w:themeColor="text1"/>
+          <w:sz w:val="24"/>
         </w:rPr>
       </w:pPr>
       <w:r>
@@ -175,12 +189,26 @@
           <w:b/>
           <w:bCs/>
           <w:color w:val="000000" w:themeColor="text1"/>
+          <w:sz w:val="24"/>
         </w:rPr>
         <w:t>CLIENT VERIFICATION &amp; CHAIN OF CUSTODY CERTIFICATE</w:t>
+      </w:r>
+      <w:r>
+        <w:rPr>
+          <w:rFonts w:ascii="Arial" w:hAnsi="Arial" w:cs="Arial"/>
+          <w:b/>
+          <w:bCs/>
+          <w:color w:val="000000" w:themeColor="text1"/>
+          <w:sz w:val="24"/>
+        </w:rPr>
+        <w:softHyphen/>
       </w:r>
     </w:p>
     <w:p>
       <w:pPr>
+        <w:tabs>
+          <w:tab w:val="left" w:pos="450"/>
+        </w:tabs>
         <w:spacing w:after="160"/>
         <w:ind w:left="270"/>
         <w:jc w:val="center"/>
@@ -189,6 +217,7 @@
           <w:i/>
           <w:iCs/>
           <w:color w:val="000000" w:themeColor="text1"/>
+          <w:sz w:val="24"/>
         </w:rPr>
       </w:pPr>
       <w:r>
@@ -197,12 +226,16 @@
           <w:i/>
           <w:iCs/>
           <w:color w:val="000000" w:themeColor="text1"/>
-        </w:rPr>
-        <w:t>Issued by Blueprint DNA Organization in respect of the attached laboratory results report</w:t>
+          <w:sz w:val="24"/>
+        </w:rPr>
+        <w:t>Issued by Blueprint DNA Organization in respect of the attached laboratory report</w:t>
       </w:r>
     </w:p>
     <w:p>
       <w:pPr>
+        <w:tabs>
+          <w:tab w:val="left" w:pos="450"/>
+        </w:tabs>
         <w:spacing w:after="160"/>
         <w:ind w:left="270"/>
         <w:jc w:val="center"/>
@@ -219,12 +252,18 @@
           <w:ilvl w:val="0"/>
           <w:numId w:val="2"/>
         </w:numPr>
+        <w:tabs>
+          <w:tab w:val="left" w:pos="450"/>
+        </w:tabs>
         <w:spacing w:before="200" w:after="80"/>
+        <w:ind w:hanging="90"/>
         <w:rPr>
           <w:rFonts w:ascii="Arial" w:hAnsi="Arial" w:cs="Arial"/>
           <w:b/>
           <w:bCs/>
           <w:color w:val="000000" w:themeColor="text1"/>
+          <w:sz w:val="22"/>
+          <w:szCs w:val="22"/>
         </w:rPr>
       </w:pPr>
       <w:r>
@@ -233,13 +272,38 @@
           <w:b/>
           <w:bCs/>
           <w:color w:val="000000" w:themeColor="text1"/>
-        </w:rPr>
-        <w:t>PARTICIPANT &amp; SAMPLE DETAILS</w:t>
+          <w:sz w:val="22"/>
+          <w:szCs w:val="22"/>
+        </w:rPr>
+        <w:softHyphen/>
+      </w:r>
+      <w:r>
+        <w:rPr>
+          <w:rFonts w:ascii="Arial" w:hAnsi="Arial" w:cs="Arial"/>
+          <w:b/>
+          <w:bCs/>
+          <w:color w:val="000000" w:themeColor="text1"/>
+          <w:sz w:val="22"/>
+          <w:szCs w:val="22"/>
+        </w:rPr>
+        <w:t xml:space="preserve">PARTICIPANT </w:t>
+      </w:r>
+      <w:r>
+        <w:rPr>
+          <w:rFonts w:ascii="Arial" w:hAnsi="Arial" w:cs="Arial"/>
+          <w:b/>
+          <w:bCs/>
+          <w:color w:val="000000" w:themeColor="text1"/>
+          <w:sz w:val="22"/>
+          <w:szCs w:val="22"/>
+        </w:rPr>
+        <w:t>DETAILS</w:t>
       </w:r>
     </w:p>
     <w:tbl>
       <w:tblPr>
-        <w:tblW w:w="10094" w:type="dxa"/>
+        <w:tblW w:w="9815" w:type="dxa"/>
+        <w:tblInd w:w="355" w:type="dxa"/>
         <w:tblCellMar>
           <w:left w:w="10" w:type="dxa"/>
           <w:right w:w="10" w:type="dxa"/>
@@ -247,10 +311,9 @@
         <w:tblLook w:val="0000" w:firstRow="0" w:lastRow="0" w:firstColumn="0" w:lastColumn="0" w:noHBand="0" w:noVBand="0"/>
       </w:tblPr>
       <w:tblGrid>
-        <w:gridCol w:w="3685"/>
-        <w:gridCol w:w="2435"/>
+        <w:gridCol w:w="4770"/>
+        <w:gridCol w:w="3065"/>
         <w:gridCol w:w="1980"/>
-        <w:gridCol w:w="1994"/>
       </w:tblGrid>
       <w:tr>
         <w:trPr>
@@ -259,7 +322,8 @@
         </w:trPr>
         <w:tc>
           <w:tcPr>
-            <w:tcW w:w="3685" w:type="dxa"/>
+            <w:tcW w:w="4770" w:type="dxa"/>
+            <w:shd w:val="clear" w:color="auto" w:fill="auto"/>
             <w:tcMar>
               <w:top w:w="60" w:type="dxa"/>
               <w:left w:w="100" w:type="dxa"/>
@@ -270,11 +334,15 @@
           </w:tcPr>
           <w:p>
             <w:pPr>
-              <w:ind w:left="270"/>
+              <w:tabs>
+                <w:tab w:val="left" w:pos="450"/>
+              </w:tabs>
               <w:rPr>
                 <w:rFonts w:ascii="Arial" w:hAnsi="Arial" w:cs="Arial"/>
                 <w:b/>
                 <w:color w:val="000000" w:themeColor="text1"/>
+                <w:sz w:val="24"/>
+                <w:szCs w:val="22"/>
               </w:rPr>
             </w:pPr>
             <w:r>
@@ -283,6 +351,8 @@
                 <w:b/>
                 <w:bCs/>
                 <w:color w:val="000000" w:themeColor="text1"/>
+                <w:sz w:val="24"/>
+                <w:szCs w:val="22"/>
               </w:rPr>
               <w:t>Full Name</w:t>
             </w:r>
@@ -290,7 +360,8 @@
         </w:tc>
         <w:tc>
           <w:tcPr>
-            <w:tcW w:w="2435" w:type="dxa"/>
+            <w:tcW w:w="3065" w:type="dxa"/>
+            <w:shd w:val="clear" w:color="auto" w:fill="auto"/>
             <w:tcMar>
               <w:top w:w="60" w:type="dxa"/>
               <w:left w:w="100" w:type="dxa"/>
@@ -301,11 +372,15 @@
           </w:tcPr>
           <w:p>
             <w:pPr>
-              <w:ind w:left="270"/>
+              <w:tabs>
+                <w:tab w:val="left" w:pos="450"/>
+              </w:tabs>
               <w:rPr>
                 <w:rFonts w:ascii="Arial" w:hAnsi="Arial" w:cs="Arial"/>
                 <w:b/>
                 <w:color w:val="000000" w:themeColor="text1"/>
+                <w:sz w:val="24"/>
+                <w:szCs w:val="22"/>
               </w:rPr>
             </w:pPr>
             <w:r>
@@ -314,6 +389,8 @@
                 <w:b/>
                 <w:bCs/>
                 <w:color w:val="000000" w:themeColor="text1"/>
+                <w:sz w:val="24"/>
+                <w:szCs w:val="22"/>
               </w:rPr>
               <w:t>Role</w:t>
             </w:r>
@@ -322,6 +399,7 @@
         <w:tc>
           <w:tcPr>
             <w:tcW w:w="1980" w:type="dxa"/>
+            <w:shd w:val="clear" w:color="auto" w:fill="auto"/>
             <w:tcMar>
               <w:top w:w="60" w:type="dxa"/>
               <w:left w:w="100" w:type="dxa"/>
@@ -332,11 +410,16 @@
           </w:tcPr>
           <w:p>
             <w:pPr>
-              <w:ind w:left="270"/>
+              <w:tabs>
+                <w:tab w:val="left" w:pos="450"/>
+              </w:tabs>
+              <w:jc w:val="right"/>
               <w:rPr>
                 <w:rFonts w:ascii="Arial" w:hAnsi="Arial" w:cs="Arial"/>
                 <w:b/>
                 <w:color w:val="000000" w:themeColor="text1"/>
+                <w:sz w:val="24"/>
+                <w:szCs w:val="22"/>
               </w:rPr>
             </w:pPr>
             <w:r>
@@ -345,14 +428,22 @@
                 <w:b/>
                 <w:bCs/>
                 <w:color w:val="000000" w:themeColor="text1"/>
+                <w:sz w:val="24"/>
+                <w:szCs w:val="22"/>
               </w:rPr>
-              <w:t>Sample Type</w:t>
+              <w:t>Date of Birth</w:t>
             </w:r>
           </w:p>
         </w:tc>
+      </w:tr>
+      <w:tr>
+        <w:trPr>
+          <w:trHeight w:val="20"/>
+        </w:trPr>
         <w:tc>
           <w:tcPr>
-            <w:tcW w:w="1994" w:type="dxa"/>
+            <w:tcW w:w="4770" w:type="dxa"/>
+            <w:shd w:val="clear" w:color="auto" w:fill="auto"/>
             <w:tcMar>
               <w:top w:w="60" w:type="dxa"/>
               <w:left w:w="100" w:type="dxa"/>
@@ -363,32 +454,31 @@
           </w:tcPr>
           <w:p>
             <w:pPr>
-              <w:ind w:left="270"/>
+              <w:tabs>
+                <w:tab w:val="left" w:pos="450"/>
+              </w:tabs>
               <w:rPr>
                 <w:rFonts w:ascii="Arial" w:hAnsi="Arial" w:cs="Arial"/>
-                <w:b/>
                 <w:color w:val="000000" w:themeColor="text1"/>
+                <w:sz w:val="22"/>
+                <w:szCs w:val="22"/>
               </w:rPr>
             </w:pPr>
             <w:r>
               <w:rPr>
                 <w:rFonts w:ascii="Arial" w:hAnsi="Arial" w:cs="Arial"/>
-                <w:b/>
-                <w:bCs/>
                 <w:color w:val="000000" w:themeColor="text1"/>
+                <w:sz w:val="22"/>
+                <w:szCs w:val="22"/>
               </w:rPr>
-              <w:t>Date Collected</w:t>
+              <w:t/>
             </w:r>
           </w:p>
         </w:tc>
-      </w:tr>
-      <w:tr>
-        <w:trPr>
-          <w:trHeight w:val="20"/>
-        </w:trPr>
         <w:tc>
           <w:tcPr>
-            <w:tcW w:w="3685" w:type="dxa"/>
+            <w:tcW w:w="3065" w:type="dxa"/>
+            <w:shd w:val="clear" w:color="auto" w:fill="auto"/>
             <w:tcMar>
               <w:top w:w="60" w:type="dxa"/>
               <w:left w:w="100" w:type="dxa"/>
@@ -399,27 +489,31 @@
           </w:tcPr>
           <w:p>
             <w:pPr>
+              <w:tabs>
+                <w:tab w:val="left" w:pos="450"/>
+              </w:tabs>
               <w:rPr>
                 <w:rFonts w:ascii="Arial" w:hAnsi="Arial" w:cs="Arial"/>
                 <w:color w:val="000000" w:themeColor="text1"/>
-                <w:sz w:val="18"/>
-                <w:szCs w:val="18"/>
+                <w:sz w:val="22"/>
+                <w:szCs w:val="22"/>
               </w:rPr>
             </w:pPr>
             <w:r>
               <w:rPr>
                 <w:rFonts w:ascii="Arial" w:hAnsi="Arial" w:cs="Arial"/>
                 <w:color w:val="000000" w:themeColor="text1"/>
-                <w:sz w:val="18"/>
-                <w:szCs w:val="18"/>
+                <w:sz w:val="22"/>
+                <w:szCs w:val="22"/>
               </w:rPr>
-              <w:t>{PARTICIPANT 1 FULL NAME}</w:t>
+              <w:t/>
             </w:r>
           </w:p>
         </w:tc>
         <w:tc>
           <w:tcPr>
-            <w:tcW w:w="2435" w:type="dxa"/>
+            <w:tcW w:w="1980" w:type="dxa"/>
+            <w:shd w:val="clear" w:color="auto" w:fill="auto"/>
             <w:tcMar>
               <w:top w:w="60" w:type="dxa"/>
               <w:left w:w="100" w:type="dxa"/>
@@ -430,214 +524,43 @@
           </w:tcPr>
           <w:p>
             <w:pPr>
+              <w:tabs>
+                <w:tab w:val="left" w:pos="450"/>
+              </w:tabs>
+              <w:jc w:val="center"/>
               <w:rPr>
                 <w:rFonts w:ascii="Arial" w:hAnsi="Arial" w:cs="Arial"/>
                 <w:color w:val="000000" w:themeColor="text1"/>
-                <w:sz w:val="18"/>
-                <w:szCs w:val="18"/>
+                <w:sz w:val="22"/>
+                <w:szCs w:val="22"/>
               </w:rPr>
             </w:pPr>
             <w:r>
               <w:rPr>
                 <w:rFonts w:ascii="Arial" w:hAnsi="Arial" w:cs="Arial"/>
                 <w:color w:val="000000" w:themeColor="text1"/>
-                <w:sz w:val="18"/>
-                <w:szCs w:val="18"/>
+                <w:sz w:val="22"/>
+                <w:szCs w:val="22"/>
               </w:rPr>
-              <w:t>{PARTICIPANT 1 ROLE}</w:t>
+              <w:t/>
             </w:r>
-          </w:p>
-        </w:tc>
-        <w:tc>
-          <w:tcPr>
-            <w:tcW w:w="1980" w:type="dxa"/>
-            <w:tcMar>
-              <w:top w:w="60" w:type="dxa"/>
-              <w:left w:w="100" w:type="dxa"/>
-              <w:bottom w:w="60" w:type="dxa"/>
-              <w:right w:w="100" w:type="dxa"/>
-            </w:tcMar>
-            <w:vAlign w:val="center"/>
-          </w:tcPr>
-          <w:p>
-            <w:pPr>
-              <w:rPr>
-                <w:rFonts w:ascii="Arial" w:hAnsi="Arial" w:cs="Arial"/>
-                <w:color w:val="000000" w:themeColor="text1"/>
-                <w:sz w:val="18"/>
-                <w:szCs w:val="18"/>
-              </w:rPr>
-            </w:pPr>
             <w:r>
               <w:rPr>
                 <w:rFonts w:ascii="Arial" w:hAnsi="Arial" w:cs="Arial"/>
                 <w:color w:val="000000" w:themeColor="text1"/>
-                <w:sz w:val="18"/>
-                <w:szCs w:val="18"/>
+                <w:sz w:val="22"/>
+                <w:szCs w:val="22"/>
               </w:rPr>
-              <w:t>BUCCAL SWAB</w:t>
+              <w:t/>
             </w:r>
-          </w:p>
-        </w:tc>
-        <w:tc>
-          <w:tcPr>
-            <w:tcW w:w="1994" w:type="dxa"/>
-            <w:tcMar>
-              <w:top w:w="60" w:type="dxa"/>
-              <w:left w:w="100" w:type="dxa"/>
-              <w:bottom w:w="60" w:type="dxa"/>
-              <w:right w:w="100" w:type="dxa"/>
-            </w:tcMar>
-            <w:vAlign w:val="center"/>
-          </w:tcPr>
-          <w:p>
-            <w:pPr>
-              <w:ind w:left="270"/>
-              <w:rPr>
-                <w:rFonts w:ascii="Arial" w:hAnsi="Arial" w:cs="Arial"/>
-                <w:color w:val="000000" w:themeColor="text1"/>
-                <w:sz w:val="18"/>
-                <w:szCs w:val="18"/>
-              </w:rPr>
-            </w:pPr>
             <w:r>
               <w:rPr>
                 <w:rFonts w:ascii="Arial" w:hAnsi="Arial" w:cs="Arial"/>
                 <w:color w:val="000000" w:themeColor="text1"/>
-                <w:sz w:val="18"/>
-                <w:szCs w:val="18"/>
+                <w:sz w:val="22"/>
+                <w:szCs w:val="22"/>
               </w:rPr>
-              <w:t>{DATE FROM CASE CODE}</w:t>
-            </w:r>
-          </w:p>
-        </w:tc>
-      </w:tr>
-      <w:tr>
-        <w:trPr>
-          <w:trHeight w:val="20"/>
-        </w:trPr>
-        <w:tc>
-          <w:tcPr>
-            <w:tcW w:w="3685" w:type="dxa"/>
-            <w:tcMar>
-              <w:top w:w="60" w:type="dxa"/>
-              <w:left w:w="100" w:type="dxa"/>
-              <w:bottom w:w="60" w:type="dxa"/>
-              <w:right w:w="100" w:type="dxa"/>
-            </w:tcMar>
-            <w:vAlign w:val="center"/>
-          </w:tcPr>
-          <w:p>
-            <w:pPr>
-              <w:rPr>
-                <w:rFonts w:ascii="Arial" w:hAnsi="Arial" w:cs="Arial"/>
-                <w:color w:val="000000" w:themeColor="text1"/>
-                <w:sz w:val="18"/>
-                <w:szCs w:val="18"/>
-              </w:rPr>
-            </w:pPr>
-            <w:r>
-              <w:rPr>
-                <w:rFonts w:ascii="Arial" w:hAnsi="Arial" w:cs="Arial"/>
-                <w:color w:val="000000" w:themeColor="text1"/>
-                <w:sz w:val="18"/>
-                <w:szCs w:val="18"/>
-              </w:rPr>
-              <w:t>{PARTICIPANT 2 FULL NAME}</w:t>
-            </w:r>
-          </w:p>
-        </w:tc>
-        <w:tc>
-          <w:tcPr>
-            <w:tcW w:w="2435" w:type="dxa"/>
-            <w:tcMar>
-              <w:top w:w="60" w:type="dxa"/>
-              <w:left w:w="100" w:type="dxa"/>
-              <w:bottom w:w="60" w:type="dxa"/>
-              <w:right w:w="100" w:type="dxa"/>
-            </w:tcMar>
-            <w:vAlign w:val="center"/>
-          </w:tcPr>
-          <w:p>
-            <w:pPr>
-              <w:rPr>
-                <w:rFonts w:ascii="Arial" w:hAnsi="Arial" w:cs="Arial"/>
-                <w:color w:val="000000" w:themeColor="text1"/>
-                <w:sz w:val="18"/>
-                <w:szCs w:val="18"/>
-              </w:rPr>
-            </w:pPr>
-            <w:r>
-              <w:rPr>
-                <w:rFonts w:ascii="Arial" w:hAnsi="Arial" w:cs="Arial"/>
-                <w:color w:val="000000" w:themeColor="text1"/>
-                <w:sz w:val="18"/>
-                <w:szCs w:val="18"/>
-              </w:rPr>
-              <w:t>{PARTICIPANT 2 ROLE}</w:t>
-            </w:r>
-          </w:p>
-        </w:tc>
-        <w:tc>
-          <w:tcPr>
-            <w:tcW w:w="1980" w:type="dxa"/>
-            <w:tcMar>
-              <w:top w:w="60" w:type="dxa"/>
-              <w:left w:w="100" w:type="dxa"/>
-              <w:bottom w:w="60" w:type="dxa"/>
-              <w:right w:w="100" w:type="dxa"/>
-            </w:tcMar>
-            <w:vAlign w:val="center"/>
-          </w:tcPr>
-          <w:p>
-            <w:pPr>
-              <w:rPr>
-                <w:rFonts w:ascii="Arial" w:hAnsi="Arial" w:cs="Arial"/>
-                <w:color w:val="000000" w:themeColor="text1"/>
-                <w:sz w:val="18"/>
-                <w:szCs w:val="18"/>
-              </w:rPr>
-            </w:pPr>
-            <w:r>
-              <w:rPr>
-                <w:rFonts w:ascii="Arial" w:hAnsi="Arial" w:cs="Arial"/>
-                <w:color w:val="000000" w:themeColor="text1"/>
-                <w:sz w:val="18"/>
-                <w:szCs w:val="18"/>
-              </w:rPr>
-              <w:t>BUCCAL SWAB</w:t>
-            </w:r>
-          </w:p>
-        </w:tc>
-        <w:tc>
-          <w:tcPr>
-            <w:tcW w:w="1994" w:type="dxa"/>
-            <w:tcMar>
-              <w:top w:w="60" w:type="dxa"/>
-              <w:left w:w="100" w:type="dxa"/>
-              <w:bottom w:w="60" w:type="dxa"/>
-              <w:right w:w="100" w:type="dxa"/>
-            </w:tcMar>
-            <w:vAlign w:val="center"/>
-          </w:tcPr>
-          <w:p>
-            <w:pPr>
-              <w:ind w:left="270"/>
-              <w:rPr>
-                <w:rFonts w:ascii="Arial" w:hAnsi="Arial" w:cs="Arial"/>
-                <w:color w:val="000000" w:themeColor="text1"/>
-                <w:sz w:val="18"/>
-                <w:szCs w:val="18"/>
-              </w:rPr>
-            </w:pPr>
-            <w:r>
-              <w:rPr>
-                <w:rFonts w:ascii="Arial" w:hAnsi="Arial" w:cs="Arial"/>
-                <w:color w:val="000000" w:themeColor="text1"/>
-                <w:sz w:val="18"/>
-                <w:szCs w:val="18"/>
-              </w:rPr>
-              <w:t>{DATE FROM CASE CODE}</w:t>
+              <w:t/>
             </w:r>
           </w:p>
         </w:tc>
@@ -645,15 +568,75 @@
     </w:tbl>
     <w:p>
       <w:pPr>
+        <w:tabs>
+          <w:tab w:val="left" w:pos="270"/>
+        </w:tabs>
+        <w:spacing w:before="200" w:after="80"/>
+        <w:rPr>
+          <w:rFonts w:ascii="Arial" w:hAnsi="Arial" w:cs="Arial"/>
+          <w:b/>
+          <w:color w:val="000000" w:themeColor="text1"/>
+          <w:sz w:val="22"/>
+          <w:szCs w:val="22"/>
+        </w:rPr>
+      </w:pPr>
+      <w:r>
+        <w:rPr>
+          <w:rFonts w:ascii="Arial" w:hAnsi="Arial" w:cs="Arial"/>
+          <w:b/>
+          <w:bCs/>
+          <w:color w:val="000000" w:themeColor="text1"/>
+        </w:rPr>
+        <w:tab/>
+      </w:r>
+      <w:r>
+        <w:rPr>
+          <w:rFonts w:ascii="Arial" w:hAnsi="Arial" w:cs="Arial"/>
+          <w:b/>
+          <w:bCs/>
+          <w:color w:val="000000" w:themeColor="text1"/>
+          <w:sz w:val="22"/>
+          <w:szCs w:val="22"/>
+        </w:rPr>
+        <w:t>2.  PARTNER LABORATORY ACCREDITATION</w:t>
+      </w:r>
+    </w:p>
+    <w:p>
+      <w:pPr>
+        <w:tabs>
+          <w:tab w:val="left" w:pos="450"/>
+        </w:tabs>
+        <w:spacing w:before="200" w:after="80"/>
+        <w:ind w:left="270" w:right="386"/>
+        <w:jc w:val="both"/>
+        <w:rPr>
+          <w:rFonts w:ascii="Arial" w:hAnsi="Arial" w:cs="Arial"/>
+          <w:color w:val="000000" w:themeColor="text1"/>
+          <w:sz w:val="22"/>
+        </w:rPr>
+      </w:pPr>
+      <w:r>
+        <w:rPr>
+          <w:rFonts w:ascii="Arial" w:hAnsi="Arial" w:cs="Arial"/>
+          <w:color w:val="000000" w:themeColor="text1"/>
+          <w:sz w:val="22"/>
+        </w:rPr>
+        <w:t>Blueprint DNA Organization works exclusively with internationally accredited partner laboratories for all DNA analysis carried out on its behalf. Depending on the test type and destination jurisdiction, our partner laboratories hold accreditation under one or more of the following recognized standards: the American Association of Blood Banks (AABB) Relationship Testing Accreditation Program, ISO/IEC 17025 (General requirements for the competence of testing and calibration laboratories), and other jurisdiction-specific accreditations (e.g. Ministry of Justice approval for court-directed parentage testing). The specific accrediting body, accreditation reference number and testing methodology used for this case are stated on the attached laboratory results report.</w:t>
+      </w:r>
+    </w:p>
+    <w:p>
+      <w:pPr>
+        <w:tabs>
+          <w:tab w:val="left" w:pos="450"/>
+        </w:tabs>
         <w:spacing w:before="200" w:after="80"/>
         <w:ind w:left="270"/>
         <w:rPr>
           <w:rFonts w:ascii="Arial" w:hAnsi="Arial" w:cs="Arial"/>
           <w:b/>
-          <w:bCs/>
-          <w:color w:val="000000" w:themeColor="text1"/>
-          <w:sz w:val="11"/>
-          <w:szCs w:val="11"/>
+          <w:color w:val="000000" w:themeColor="text1"/>
+          <w:sz w:val="22"/>
+          <w:szCs w:val="22"/>
         </w:rPr>
       </w:pPr>
       <w:r>
@@ -662,127 +645,304 @@
           <w:b/>
           <w:bCs/>
           <w:color w:val="000000" w:themeColor="text1"/>
-          <w:sz w:val="11"/>
-          <w:szCs w:val="11"/>
-        </w:rPr>
-        <w:t>{</w:t>
-      </w:r>
-      <w:proofErr w:type="gramStart"/>
+          <w:sz w:val="22"/>
+          <w:szCs w:val="22"/>
+        </w:rPr>
+        <w:t>3.  CHAIN OF CUSTODY</w:t>
+      </w:r>
+    </w:p>
+    <w:p>
+      <w:pPr>
+        <w:tabs>
+          <w:tab w:val="left" w:pos="450"/>
+        </w:tabs>
+        <w:spacing w:after="120"/>
+        <w:ind w:left="270" w:right="386"/>
+        <w:jc w:val="both"/>
+        <w:rPr>
+          <w:rFonts w:ascii="Arial" w:hAnsi="Arial" w:cs="Arial"/>
+          <w:color w:val="000000" w:themeColor="text1"/>
+          <w:sz w:val="22"/>
+        </w:rPr>
+      </w:pPr>
+      <w:r>
+        <w:rPr>
+          <w:rFonts w:ascii="Arial" w:hAnsi="Arial" w:cs="Arial"/>
+          <w:color w:val="000000" w:themeColor="text1"/>
+          <w:sz w:val="22"/>
+        </w:rPr>
+        <w:t>A strict chain of custody is maintained by Blueprint DNA Organization at every stage of this case. Samples were collected by a trained, official Blueprint DNA collector, who verified each participant's identity against government-issued photographic identification at the point of collection and completed the required chain-of- custody</w:t>
+      </w:r>
+      <w:r>
+        <w:rPr>
+          <w:rFonts w:ascii="Arial" w:hAnsi="Arial" w:cs="Arial"/>
+          <w:color w:val="000000" w:themeColor="text1"/>
+          <w:sz w:val="22"/>
+        </w:rPr>
+        <w:t xml:space="preserve"> documentation. Samples were </w:t>
+      </w:r>
+      <w:r>
+        <w:rPr>
+          <w:rFonts w:ascii="Arial" w:hAnsi="Arial" w:cs="Arial"/>
+          <w:color w:val="000000" w:themeColor="text1"/>
+          <w:sz w:val="22"/>
+        </w:rPr>
+        <w:t xml:space="preserve">sealed at collection </w:t>
+      </w:r>
+      <w:r>
+        <w:rPr>
+          <w:rFonts w:ascii="Arial" w:hAnsi="Arial" w:cs="Arial"/>
+          <w:color w:val="000000" w:themeColor="text1"/>
+          <w:sz w:val="22"/>
+        </w:rPr>
+        <w:t>and shipped securely to the partn</w:t>
+      </w:r>
+      <w:r>
+        <w:rPr>
+          <w:rFonts w:ascii="Arial" w:hAnsi="Arial" w:cs="Arial"/>
+          <w:color w:val="000000" w:themeColor="text1"/>
+          <w:sz w:val="22"/>
+        </w:rPr>
+        <w:t>er laboratory with custody documentation checked on receipt prior to testing.</w:t>
+      </w:r>
+    </w:p>
+    <w:p>
+      <w:pPr>
+        <w:tabs>
+          <w:tab w:val="left" w:pos="450"/>
+        </w:tabs>
+        <w:spacing w:before="200" w:after="80"/>
+        <w:ind w:left="270"/>
+        <w:rPr>
+          <w:rFonts w:ascii="Arial" w:hAnsi="Arial" w:cs="Arial"/>
+          <w:b/>
+          <w:color w:val="000000" w:themeColor="text1"/>
+          <w:sz w:val="22"/>
+          <w:szCs w:val="22"/>
+        </w:rPr>
+      </w:pPr>
       <w:r>
         <w:rPr>
           <w:rFonts w:ascii="Arial" w:hAnsi="Arial" w:cs="Arial"/>
           <w:b/>
           <w:bCs/>
           <w:color w:val="000000" w:themeColor="text1"/>
-          <w:sz w:val="11"/>
-          <w:szCs w:val="11"/>
-        </w:rPr>
-        <w:t>SO</w:t>
-      </w:r>
-      <w:proofErr w:type="gramEnd"/>
-      <w:r>
-        <w:rPr>
-          <w:rFonts w:ascii="Arial" w:hAnsi="Arial" w:cs="Arial"/>
-          <w:b/>
-          <w:bCs/>
-          <w:color w:val="000000" w:themeColor="text1"/>
-          <w:sz w:val="11"/>
-          <w:szCs w:val="11"/>
-        </w:rPr>
-        <w:t xml:space="preserve"> YOU ADD NEW ROWS TO THE BORDERLESS PARTICIPANT </w:t>
-      </w:r>
-      <w:r>
-        <w:rPr>
-          <w:rFonts w:ascii="Arial" w:hAnsi="Arial" w:cs="Arial"/>
-          <w:b/>
-          <w:bCs/>
-          <w:color w:val="000000" w:themeColor="text1"/>
-          <w:sz w:val="11"/>
-          <w:szCs w:val="11"/>
-        </w:rPr>
-        <w:t xml:space="preserve">INCASE THE PARTICIPANTS ARE MORE THAN TWO ALL THE WAY TILL 6 KEEPING THE FORMATING AND STYLE AS IT IS </w:t>
-      </w:r>
-      <w:proofErr w:type="gramStart"/>
-      <w:r>
-        <w:rPr>
-          <w:rFonts w:ascii="Arial" w:hAnsi="Arial" w:cs="Arial"/>
-          <w:b/>
-          <w:bCs/>
-          <w:color w:val="000000" w:themeColor="text1"/>
-          <w:sz w:val="11"/>
-          <w:szCs w:val="11"/>
-        </w:rPr>
-        <w:t>INT HIS</w:t>
-      </w:r>
-      <w:proofErr w:type="gramEnd"/>
-      <w:r>
-        <w:rPr>
-          <w:rFonts w:ascii="Arial" w:hAnsi="Arial" w:cs="Arial"/>
-          <w:b/>
-          <w:bCs/>
-          <w:color w:val="000000" w:themeColor="text1"/>
-          <w:sz w:val="11"/>
-          <w:szCs w:val="11"/>
-        </w:rPr>
-        <w:t xml:space="preserve"> DOCUMENT. THIS PORTION OF THE </w:t>
-      </w:r>
-      <w:r>
-        <w:rPr>
-          <w:rFonts w:ascii="Arial" w:hAnsi="Arial" w:cs="Arial"/>
-          <w:b/>
-          <w:bCs/>
-          <w:color w:val="000000" w:themeColor="text1"/>
-          <w:sz w:val="11"/>
-          <w:szCs w:val="11"/>
-        </w:rPr>
-        <w:t>page</w:t>
-      </w:r>
-      <w:r>
-        <w:rPr>
-          <w:rFonts w:ascii="Arial" w:hAnsi="Arial" w:cs="Arial"/>
-          <w:b/>
-          <w:bCs/>
-          <w:color w:val="000000" w:themeColor="text1"/>
-          <w:sz w:val="11"/>
-          <w:szCs w:val="11"/>
-        </w:rPr>
-        <w:t xml:space="preserve"> SHOUL DBE REMOVED IN THE ACTUAL VERIFICATION PAGE EDITED FILE</w:t>
-      </w:r>
-      <w:r>
-        <w:rPr>
-          <w:rFonts w:ascii="Arial" w:hAnsi="Arial" w:cs="Arial"/>
-          <w:b/>
-          <w:bCs/>
-          <w:color w:val="000000" w:themeColor="text1"/>
-          <w:sz w:val="11"/>
-          <w:szCs w:val="11"/>
-        </w:rPr>
-        <w:t>}</w:t>
+          <w:sz w:val="22"/>
+          <w:szCs w:val="22"/>
+        </w:rPr>
+        <w:t>4.  MEDICAL DIRECTOR’S ATTESTATION</w:t>
       </w:r>
     </w:p>
     <w:p>
       <w:pPr>
-        <w:spacing w:before="200" w:after="80" w:line="360" w:lineRule="auto"/>
-        <w:ind w:left="270"/>
-        <w:rPr>
-          <w:rFonts w:ascii="Arial" w:hAnsi="Arial" w:cs="Arial"/>
-          <w:b/>
-          <w:color w:val="000000" w:themeColor="text1"/>
-        </w:rPr>
-      </w:pPr>
-      <w:r>
-        <w:rPr>
-          <w:rFonts w:ascii="Arial" w:hAnsi="Arial" w:cs="Arial"/>
-          <w:b/>
-          <w:bCs/>
-          <w:color w:val="000000" w:themeColor="text1"/>
-        </w:rPr>
-        <w:t>2.  PARTNER LABORATORY ACCREDITATION</w:t>
+        <w:tabs>
+          <w:tab w:val="left" w:pos="450"/>
+        </w:tabs>
+        <w:spacing w:after="120"/>
+        <w:ind w:left="270" w:right="386"/>
+        <w:jc w:val="both"/>
+        <w:rPr>
+          <w:rFonts w:ascii="Arial" w:hAnsi="Arial" w:cs="Arial"/>
+          <w:color w:val="000000" w:themeColor="text1"/>
+          <w:sz w:val="22"/>
+        </w:rPr>
+      </w:pPr>
+      <w:r>
+        <w:rPr>
+          <w:rFonts w:ascii="Arial" w:hAnsi="Arial" w:cs="Arial"/>
+          <w:color w:val="000000" w:themeColor="text1"/>
+          <w:sz w:val="22"/>
+        </w:rPr>
+        <w:t>I have reviewed the collection and chain-of-custody records for this case. I confirm that the samples listed above were collected, identity-verified, sealed and dispatched in line with Blueprint DN</w:t>
+      </w:r>
+      <w:r>
+        <w:rPr>
+          <w:rFonts w:ascii="Arial" w:hAnsi="Arial" w:cs="Arial"/>
+          <w:color w:val="000000" w:themeColor="text1"/>
+          <w:sz w:val="22"/>
+        </w:rPr>
+        <w:t>A's chain-of-custody procedure.</w:t>
       </w:r>
     </w:p>
     <w:p>
       <w:pPr>
-        <w:spacing w:before="200" w:after="80" w:line="360" w:lineRule="auto"/>
+        <w:tabs>
+          <w:tab w:val="left" w:pos="450"/>
+        </w:tabs>
+        <w:spacing w:after="120"/>
+        <w:ind w:right="386"/>
+        <w:jc w:val="both"/>
+        <w:rPr>
+          <w:rFonts w:ascii="Arial" w:hAnsi="Arial" w:cs="Arial"/>
+          <w:color w:val="000000" w:themeColor="text1"/>
+          <w:sz w:val="22"/>
+        </w:rPr>
+      </w:pPr>
+      <w:r>
+        <w:rPr>
+          <w:rFonts w:ascii="Arial" w:hAnsi="Arial" w:cs="Arial"/>
+          <w:noProof/>
+          <w:color w:val="000000" w:themeColor="text1"/>
+          <w:sz w:val="22"/>
+        </w:rPr>
+        <w:drawing>
+          <wp:anchor distT="0" distB="0" distL="114300" distR="114300" simplePos="0" relativeHeight="251659264" behindDoc="0" locked="0" layoutInCell="1" allowOverlap="1">
+            <wp:simplePos x="0" y="0"/>
+            <wp:positionH relativeFrom="column">
+              <wp:posOffset>162560</wp:posOffset>
+            </wp:positionH>
+            <wp:positionV relativeFrom="paragraph">
+              <wp:posOffset>-3810</wp:posOffset>
+            </wp:positionV>
+            <wp:extent cx="723265" cy="440690"/>
+            <wp:effectExtent l="0" t="0" r="635" b="0"/>
+            <wp:wrapSquare wrapText="bothSides"/>
+            <wp:docPr id="2" name="Picture 2"/>
+            <wp:cNvGraphicFramePr>
+              <a:graphicFrameLocks xmlns:a="http://schemas.openxmlformats.org/drawingml/2006/main" noChangeAspect="1"/>
+            </wp:cNvGraphicFramePr>
+            <a:graphic xmlns:a="http://schemas.openxmlformats.org/drawingml/2006/main">
+              <a:graphicData uri="http://schemas.openxmlformats.org/drawingml/2006/picture">
+                <pic:pic xmlns:pic="http://schemas.openxmlformats.org/drawingml/2006/picture">
+                  <pic:nvPicPr>
+                    <pic:cNvPr id="2" name="signature_black (1).png"/>
+                    <pic:cNvPicPr/>
+                  </pic:nvPicPr>
+                  <pic:blipFill>
+                    <a:blip r:embed="rId8" cstate="print">
+                      <a:extLst>
+                        <a:ext uri="{28A0092B-C50C-407E-A947-70E740481C1C}">
+                          <a14:useLocalDpi xmlns:a14="http://schemas.microsoft.com/office/drawing/2010/main" val="0"/>
+                        </a:ext>
+                      </a:extLst>
+                    </a:blip>
+                    <a:stretch>
+                      <a:fillRect/>
+                    </a:stretch>
+                  </pic:blipFill>
+                  <pic:spPr>
+                    <a:xfrm>
+                      <a:off x="0" y="0"/>
+                      <a:ext cx="723265" cy="440690"/>
+                    </a:xfrm>
+                    <a:prstGeom prst="rect">
+                      <a:avLst/>
+                    </a:prstGeom>
+                  </pic:spPr>
+                </pic:pic>
+              </a:graphicData>
+            </a:graphic>
+            <wp14:sizeRelH relativeFrom="margin">
+              <wp14:pctWidth>0</wp14:pctWidth>
+            </wp14:sizeRelH>
+            <wp14:sizeRelV relativeFrom="margin">
+              <wp14:pctHeight>0</wp14:pctHeight>
+            </wp14:sizeRelV>
+          </wp:anchor>
+        </w:drawing>
+      </w:r>
+    </w:p>
+    <w:p>
+      <w:pPr>
+        <w:tabs>
+          <w:tab w:val="left" w:pos="450"/>
+        </w:tabs>
+        <w:spacing w:after="120"/>
+        <w:ind w:right="386"/>
+        <w:jc w:val="both"/>
+        <w:rPr>
+          <w:rFonts w:ascii="Arial" w:hAnsi="Arial" w:cs="Arial"/>
+          <w:color w:val="000000" w:themeColor="text1"/>
+          <w:sz w:val="22"/>
+        </w:rPr>
+      </w:pPr>
+      <w:r>
+        <w:rPr>
+          <w:rFonts w:ascii="Arial" w:hAnsi="Arial" w:cs="Arial"/>
+          <w:color w:val="000000" w:themeColor="text1"/>
+          <w:sz w:val="22"/>
+        </w:rPr>
+        <w:softHyphen/>
+      </w:r>
+      <w:r>
+        <w:rPr>
+          <w:rFonts w:ascii="Arial" w:hAnsi="Arial" w:cs="Arial"/>
+          <w:color w:val="000000" w:themeColor="text1"/>
+          <w:sz w:val="22"/>
+        </w:rPr>
+        <w:tab/>
+      </w:r>
+      <w:r>
+        <w:rPr>
+          <w:rFonts w:ascii="Arial" w:hAnsi="Arial" w:cs="Arial"/>
+          <w:color w:val="000000" w:themeColor="text1"/>
+          <w:sz w:val="22"/>
+        </w:rPr>
+        <w:tab/>
+      </w:r>
+      <w:r>
+        <w:rPr>
+          <w:rFonts w:ascii="Arial" w:hAnsi="Arial" w:cs="Arial"/>
+          <w:color w:val="000000" w:themeColor="text1"/>
+          <w:sz w:val="22"/>
+        </w:rPr>
+        <w:tab/>
+      </w:r>
+      <w:r>
+        <w:rPr>
+          <w:rFonts w:ascii="Arial" w:hAnsi="Arial" w:cs="Arial"/>
+          <w:color w:val="000000" w:themeColor="text1"/>
+          <w:sz w:val="22"/>
+        </w:rPr>
+        <w:tab/>
+      </w:r>
+      <w:r>
+        <w:rPr>
+          <w:rFonts w:ascii="Arial" w:hAnsi="Arial" w:cs="Arial"/>
+          <w:color w:val="000000" w:themeColor="text1"/>
+          <w:sz w:val="22"/>
+        </w:rPr>
+        <w:tab/>
+      </w:r>
+      <w:r>
+        <w:rPr>
+          <w:rFonts w:ascii="Arial" w:hAnsi="Arial" w:cs="Arial"/>
+          <w:color w:val="000000" w:themeColor="text1"/>
+          <w:sz w:val="22"/>
+        </w:rPr>
+        <w:tab/>
+      </w:r>
+      <w:r>
+        <w:rPr>
+          <w:rFonts w:ascii="Arial" w:hAnsi="Arial" w:cs="Arial"/>
+          <w:color w:val="000000" w:themeColor="text1"/>
+          <w:sz w:val="22"/>
+        </w:rPr>
+        <w:tab/>
+      </w:r>
+      <w:r>
+        <w:rPr>
+          <w:rFonts w:ascii="Arial" w:hAnsi="Arial" w:cs="Arial"/>
+          <w:color w:val="000000" w:themeColor="text1"/>
+          <w:sz w:val="22"/>
+        </w:rPr>
+        <w:tab/>
+      </w:r>
+      <w:r>
+        <w:rPr>
+          <w:rFonts w:ascii="Arial" w:hAnsi="Arial" w:cs="Arial"/>
+          <w:color w:val="000000" w:themeColor="text1"/>
+          <w:sz w:val="22"/>
+        </w:rPr>
+        <w:tab/>
+      </w:r>
+    </w:p>
+    <w:p>
+      <w:pPr>
+        <w:tabs>
+          <w:tab w:val="left" w:pos="450"/>
+        </w:tabs>
+        <w:spacing w:after="120"/>
         <w:ind w:left="270" w:right="386"/>
         <w:jc w:val="both"/>
         <w:rPr>
@@ -795,8 +955,17 @@
           <w:rFonts w:ascii="Arial" w:hAnsi="Arial" w:cs="Arial"/>
           <w:color w:val="000000" w:themeColor="text1"/>
         </w:rPr>
-        <w:t>Blueprint DNA Organization works exclusively with internationally accredited partner laboratories for all DNA analysis carried out on its behalf. Depending on the test type and destination jurisdiction, our partner laboratories hold accreditation under one or more of the following recognized standards: the American</w:t>
-      </w:r>
+        <w:t xml:space="preserve">Dr. </w:t>
+      </w:r>
+      <w:proofErr w:type="spellStart"/>
+      <w:r>
+        <w:rPr>
+          <w:rFonts w:ascii="Arial" w:hAnsi="Arial" w:cs="Arial"/>
+          <w:color w:val="000000" w:themeColor="text1"/>
+        </w:rPr>
+        <w:t>Abeiku</w:t>
+      </w:r>
+      <w:proofErr w:type="spellEnd"/>
       <w:r>
         <w:rPr>
           <w:rFonts w:ascii="Arial" w:hAnsi="Arial" w:cs="Arial"/>
@@ -804,79 +973,73 @@
         </w:rPr>
         <w:t xml:space="preserve"> </w:t>
       </w:r>
-      <w:r>
-        <w:rPr>
-          <w:rFonts w:ascii="Arial" w:hAnsi="Arial" w:cs="Arial"/>
-          <w:color w:val="000000" w:themeColor="text1"/>
-        </w:rPr>
-        <w:t>Association of Blood Banks (AABB) Relationship</w:t>
-      </w:r>
-      <w:r>
-        <w:rPr>
-          <w:rFonts w:ascii="Arial" w:hAnsi="Arial" w:cs="Arial"/>
-          <w:color w:val="000000" w:themeColor="text1"/>
-        </w:rPr>
-        <w:t xml:space="preserve"> Testing Accreditation Program, </w:t>
-      </w:r>
-      <w:r>
-        <w:rPr>
-          <w:rFonts w:ascii="Arial" w:hAnsi="Arial" w:cs="Arial"/>
-          <w:color w:val="000000" w:themeColor="text1"/>
-        </w:rPr>
-        <w:t xml:space="preserve">ISO/IEC 17025 </w:t>
-      </w:r>
-      <w:r>
-        <w:rPr>
-          <w:rFonts w:ascii="Arial" w:hAnsi="Arial" w:cs="Arial"/>
-          <w:color w:val="000000" w:themeColor="text1"/>
-        </w:rPr>
-        <w:t xml:space="preserve">(General </w:t>
-      </w:r>
-      <w:r>
-        <w:rPr>
-          <w:rFonts w:ascii="Arial" w:hAnsi="Arial" w:cs="Arial"/>
-          <w:color w:val="000000" w:themeColor="text1"/>
-        </w:rPr>
-        <w:t xml:space="preserve">requirements for the competence of testing and calibration laboratories), </w:t>
-      </w:r>
-      <w:r>
-        <w:rPr>
-          <w:rFonts w:ascii="Arial" w:hAnsi="Arial" w:cs="Arial"/>
-          <w:color w:val="000000" w:themeColor="text1"/>
-        </w:rPr>
-        <w:t xml:space="preserve">and other jurisdiction-specific </w:t>
-      </w:r>
-      <w:r>
-        <w:rPr>
-          <w:rFonts w:ascii="Arial" w:hAnsi="Arial" w:cs="Arial"/>
-          <w:color w:val="000000" w:themeColor="text1"/>
-        </w:rPr>
-        <w:t>accreditations (e.g. Ministry of Justice approval for court-directed parentage testing). The specific accrediting body, accreditation reference number and testing methodology used for this case are stated on the attached laboratory results report.</w:t>
+      <w:proofErr w:type="spellStart"/>
+      <w:r>
+        <w:rPr>
+          <w:rFonts w:ascii="Arial" w:hAnsi="Arial" w:cs="Arial"/>
+          <w:color w:val="000000" w:themeColor="text1"/>
+        </w:rPr>
+        <w:t>Ghansah</w:t>
+      </w:r>
+      <w:proofErr w:type="spellEnd"/>
+      <w:r>
+        <w:rPr>
+          <w:rFonts w:ascii="Arial" w:hAnsi="Arial" w:cs="Arial"/>
+          <w:color w:val="000000" w:themeColor="text1"/>
+        </w:rPr>
+        <w:t xml:space="preserve">, </w:t>
+      </w:r>
+      <w:proofErr w:type="spellStart"/>
+      <w:r>
+        <w:rPr>
+          <w:rFonts w:ascii="Arial" w:hAnsi="Arial" w:cs="Arial"/>
+          <w:color w:val="000000" w:themeColor="text1"/>
+        </w:rPr>
+        <w:t>MBChB</w:t>
+      </w:r>
+      <w:proofErr w:type="spellEnd"/>
+      <w:r>
+        <w:rPr>
+          <w:rFonts w:ascii="Arial" w:hAnsi="Arial" w:cs="Arial"/>
+          <w:color w:val="000000" w:themeColor="text1"/>
+        </w:rPr>
+        <w:t>, MBA (MDC/RN/0846)</w:t>
       </w:r>
     </w:p>
     <w:p>
       <w:pPr>
-        <w:spacing w:before="200" w:after="80" w:line="360" w:lineRule="auto"/>
-        <w:ind w:left="270"/>
-        <w:rPr>
-          <w:rFonts w:ascii="Arial" w:hAnsi="Arial" w:cs="Arial"/>
-          <w:b/>
-          <w:color w:val="000000" w:themeColor="text1"/>
-        </w:rPr>
-      </w:pPr>
-      <w:r>
-        <w:rPr>
-          <w:rFonts w:ascii="Arial" w:hAnsi="Arial" w:cs="Arial"/>
-          <w:b/>
-          <w:bCs/>
-          <w:color w:val="000000" w:themeColor="text1"/>
-        </w:rPr>
-        <w:t>3.  CHAIN OF CUSTODY</w:t>
+        <w:tabs>
+          <w:tab w:val="left" w:pos="450"/>
+        </w:tabs>
+        <w:spacing w:after="120"/>
+        <w:ind w:left="270" w:right="386"/>
+        <w:jc w:val="both"/>
+        <w:rPr>
+          <w:rFonts w:ascii="Arial" w:hAnsi="Arial" w:cs="Arial"/>
+          <w:color w:val="000000" w:themeColor="text1"/>
+        </w:rPr>
+      </w:pPr>
+      <w:r>
+        <w:rPr>
+          <w:rFonts w:ascii="Arial" w:hAnsi="Arial" w:cs="Arial"/>
+          <w:color w:val="000000" w:themeColor="text1"/>
+        </w:rPr>
+        <w:t>Medi</w:t>
+      </w:r>
+      <w:r>
+        <w:rPr>
+          <w:rFonts w:ascii="Arial" w:hAnsi="Arial" w:cs="Arial"/>
+          <w:color w:val="000000" w:themeColor="text1"/>
+        </w:rPr>
+        <w:t>cal Director, Blueprint DNA Ltd</w:t>
       </w:r>
     </w:p>
     <w:p>
       <w:pPr>
-        <w:spacing w:after="120" w:line="360" w:lineRule="auto"/>
+        <w:tabs>
+          <w:tab w:val="left" w:pos="450"/>
+        </w:tabs>
+        <w:spacing w:after="120"/>
         <w:ind w:left="270" w:right="386"/>
         <w:jc w:val="both"/>
         <w:rPr>
@@ -884,111 +1047,17 @@
           <w:color w:val="000000" w:themeColor="text1"/>
         </w:rPr>
       </w:pPr>
-      <w:r>
-        <w:rPr>
-          <w:rFonts w:ascii="Arial" w:hAnsi="Arial" w:cs="Arial"/>
-          <w:color w:val="000000" w:themeColor="text1"/>
-        </w:rPr>
-        <w:t>A strict chain of custody is maintained by Blueprint DNA Organization at every s</w:t>
-      </w:r>
-      <w:r>
-        <w:rPr>
-          <w:rFonts w:ascii="Arial" w:hAnsi="Arial" w:cs="Arial"/>
-          <w:color w:val="000000" w:themeColor="text1"/>
-        </w:rPr>
-        <w:t xml:space="preserve">tage of this case. Samples were </w:t>
-      </w:r>
-      <w:r>
-        <w:rPr>
-          <w:rFonts w:ascii="Arial" w:hAnsi="Arial" w:cs="Arial"/>
-          <w:color w:val="000000" w:themeColor="text1"/>
-        </w:rPr>
-        <w:t>collected by a trained, official Blueprint DNA collector, who verified each</w:t>
-      </w:r>
-      <w:r>
-        <w:rPr>
-          <w:rFonts w:ascii="Arial" w:hAnsi="Arial" w:cs="Arial"/>
-          <w:color w:val="000000" w:themeColor="text1"/>
-        </w:rPr>
-        <w:t xml:space="preserve"> participant's identity against </w:t>
-      </w:r>
-      <w:r>
-        <w:rPr>
-          <w:rFonts w:ascii="Arial" w:hAnsi="Arial" w:cs="Arial"/>
-          <w:color w:val="000000" w:themeColor="text1"/>
-        </w:rPr>
-        <w:t>government-issued photographic identification at the point of collection and c</w:t>
-      </w:r>
-      <w:r>
-        <w:rPr>
-          <w:rFonts w:ascii="Arial" w:hAnsi="Arial" w:cs="Arial"/>
-          <w:color w:val="000000" w:themeColor="text1"/>
-        </w:rPr>
-        <w:t xml:space="preserve">ompleted the required chain-of- </w:t>
-      </w:r>
-      <w:r>
-        <w:rPr>
-          <w:rFonts w:ascii="Arial" w:hAnsi="Arial" w:cs="Arial"/>
-          <w:color w:val="000000" w:themeColor="text1"/>
-        </w:rPr>
-        <w:t>custody documentation. Samples were sealed at collection and shipped securely to the mother laboratory with custody documentation checked on receipt prior to testing</w:t>
-      </w:r>
-      <w:r>
-        <w:rPr>
-          <w:rFonts w:ascii="Arial" w:hAnsi="Arial" w:cs="Arial"/>
-          <w:color w:val="000000" w:themeColor="text1"/>
-        </w:rPr>
-        <w:t xml:space="preserve">. </w:t>
-      </w:r>
+      <w:bookmarkStart w:id="0" w:name="_GoBack"/>
+      <w:bookmarkEnd w:id="0"/>
     </w:p>
     <w:p>
       <w:pPr>
-        <w:spacing w:before="160"/>
-        <w:rPr>
-          <w:rFonts w:ascii="Arial" w:hAnsi="Arial" w:cs="Arial"/>
-          <w:color w:val="000000" w:themeColor="text1"/>
-        </w:rPr>
-      </w:pPr>
-    </w:p>
-    <w:p>
-      <w:pPr>
-        <w:spacing w:before="160"/>
-        <w:rPr>
-          <w:rFonts w:ascii="Arial" w:hAnsi="Arial" w:cs="Arial"/>
-          <w:color w:val="000000" w:themeColor="text1"/>
-        </w:rPr>
-      </w:pPr>
-    </w:p>
-    <w:p>
-      <w:pPr>
-        <w:spacing w:before="160"/>
-        <w:rPr>
-          <w:rFonts w:ascii="Arial" w:hAnsi="Arial" w:cs="Arial"/>
-          <w:color w:val="000000" w:themeColor="text1"/>
-        </w:rPr>
-      </w:pPr>
-    </w:p>
-    <w:p>
-      <w:pPr>
-        <w:spacing w:before="160"/>
-        <w:rPr>
-          <w:rFonts w:ascii="Arial" w:hAnsi="Arial" w:cs="Arial"/>
-          <w:color w:val="000000" w:themeColor="text1"/>
-        </w:rPr>
-      </w:pPr>
-    </w:p>
-    <w:p>
-      <w:pPr>
-        <w:spacing w:before="160"/>
-        <w:rPr>
-          <w:rFonts w:ascii="Arial" w:hAnsi="Arial" w:cs="Arial"/>
-          <w:color w:val="000000" w:themeColor="text1"/>
-        </w:rPr>
-      </w:pPr>
-    </w:p>
-    <w:p>
-      <w:pPr>
-        <w:spacing w:before="160"/>
+        <w:tabs>
+          <w:tab w:val="left" w:pos="450"/>
+        </w:tabs>
+        <w:spacing w:after="120"/>
+        <w:ind w:left="270" w:right="386"/>
+        <w:jc w:val="both"/>
         <w:rPr>
           <w:rFonts w:ascii="Arial" w:hAnsi="Arial" w:cs="Arial"/>
           <w:color w:val="000000" w:themeColor="text1"/>
@@ -1025,10 +1094,14 @@
           </w:tcPr>
           <w:p>
             <w:pPr>
-              <w:jc w:val="both"/>
+              <w:tabs>
+                <w:tab w:val="left" w:pos="450"/>
+              </w:tabs>
+              <w:jc w:val="center"/>
               <w:rPr>
                 <w:rFonts w:ascii="Arial" w:hAnsi="Arial" w:cs="Arial"/>
                 <w:color w:val="000000" w:themeColor="text1"/>
+                <w:sz w:val="16"/>
               </w:rPr>
             </w:pPr>
             <w:r>
@@ -1036,9 +1109,32 @@
                 <w:rFonts w:ascii="Arial" w:hAnsi="Arial" w:cs="Arial"/>
                 <w:i/>
                 <w:color w:val="000000" w:themeColor="text1"/>
+                <w:sz w:val="16"/>
                 <w:szCs w:val="16"/>
               </w:rPr>
-              <w:t>Government-issued photo identification for each participant named above was verified during sample collection and is retained on file at Blueprint DNA Organization. Full chain-of-custody documentation and participant identification records are available for review upon request by authorized legal entities.</w:t>
+              <w:t xml:space="preserve">Government-issued photo identification for each participant named above </w:t>
+            </w:r>
+            <w:proofErr w:type="gramStart"/>
+            <w:r>
+              <w:rPr>
+                <w:rFonts w:ascii="Arial" w:hAnsi="Arial" w:cs="Arial"/>
+                <w:i/>
+                <w:color w:val="000000" w:themeColor="text1"/>
+                <w:sz w:val="16"/>
+                <w:szCs w:val="16"/>
+              </w:rPr>
+              <w:t>was verified</w:t>
+            </w:r>
+            <w:proofErr w:type="gramEnd"/>
+            <w:r>
+              <w:rPr>
+                <w:rFonts w:ascii="Arial" w:hAnsi="Arial" w:cs="Arial"/>
+                <w:i/>
+                <w:color w:val="000000" w:themeColor="text1"/>
+                <w:sz w:val="16"/>
+                <w:szCs w:val="16"/>
+              </w:rPr>
+              <w:t xml:space="preserve"> during sample collection and is retained on file at Blueprint DNA Organization. Full chain-of-custody documentation and participant identification records are available for review upon request by authorized legal entities.</w:t>
             </w:r>
           </w:p>
         </w:tc>
@@ -1046,6 +1142,9 @@
     </w:tbl>
     <w:p>
       <w:pPr>
+        <w:tabs>
+          <w:tab w:val="left" w:pos="450"/>
+        </w:tabs>
         <w:spacing w:before="40"/>
         <w:rPr>
           <w:rFonts w:ascii="Arial" w:hAnsi="Arial" w:cs="Arial"/>
@@ -1054,7 +1153,7 @@
       </w:pPr>
     </w:p>
     <w:sectPr>
-      <w:footerReference w:type="default" r:id="rId8"/>
+      <w:footerReference w:type="default" r:id="rId9"/>
       <w:pgSz w:w="11906" w:h="16838"/>
       <w:pgMar w:top="1080" w:right="720" w:bottom="560" w:left="720" w:header="708" w:footer="535" w:gutter="0"/>
       <w:cols w:space="720"/>
@@ -1065,7 +1164,7 @@
 </file>
 
 <file path=word/endnotes.xml><?xml version="1.0" encoding="utf-8"?>
-<w:endnotes xmlns:wpc="http://schemas.microsoft.com/office/word/2010/wordprocessingCanvas" xmlns:cx="http://schemas.microsoft.com/office/drawing/2014/chartex" xmlns:cx1="http://schemas.microsoft.com/office/drawing/2015/9/8/chartex" xmlns:cx2="http://schemas.microsoft.com/office/drawing/2015/10/21/chartex" xmlns:cx3="http://schemas.microsoft.com/office/drawing/2016/5/9/chartex" xmlns:cx4="http://schemas.microsoft.com/office/drawing/2016/5/10/chartex" xmlns:cx5="http://schemas.microsoft.com/office/drawing/2016/5/11/chartex" xmlns:cx6="http://schemas.microsoft.com/office/drawing/2016/5/12/chartex" xmlns:cx7="http://schemas.microsoft.com/office/drawing/2016/5/13/chartex" xmlns:cx8="http://schemas.microsoft.com/office/drawing/2016/5/14/chartex" xmlns:mc="http://schemas.openxmlformats.org/markup-compatibility/2006" xmlns:m="http://schemas.openxmlformats.org/officeDocument/2006/math" xmlns:aink="http://schemas.microsoft.com/office/drawing/2016/ink" xmlns:am3d="http://schemas.microsoft.com/office/drawing/2017/model3d" xmlns:oel="http://schemas.microsoft.com/office/2019/extlst" xmlns:r="http://schemas.openxmlformats.org/officeDocument/2006/relationships" xmlns:wp14="http://schemas.microsoft.com/office/word/2010/wordprocessingDrawing" xmlns:wp="http://schemas.openxmlformats.org/drawingml/2006/wordprocessingDrawing" xmlns:wpg="http://schemas.microsoft.com/office/word/2010/wordprocessingGroup" xmlns:wpi="http://schemas.microsoft.com/office/word/2010/wordprocessingInk" xmlns:wps="http://schemas.microsoft.com/office/word/2010/wordprocessingShape" xmlns:o="urn:schemas-microsoft-com:office:office" xmlns:v="urn:schemas-microsoft-com:vml" xmlns:w10="urn:schemas-microsoft-com:office:word" xmlns:w="http://schemas.openxmlformats.org/wordprocessingml/2006/main" xmlns:w14="http://schemas.microsoft.com/office/word/2010/wordml" xmlns:w15="http://schemas.microsoft.com/office/word/2012/wordml" xmlns:w16cex="http://schemas.microsoft.com/office/word/2018/wordml/cex" xmlns:w16cid="http://schemas.microsoft.com/office/word/2016/wordml/cid" xmlns:w16="http://schemas.microsoft.com/office/word/2018/wordml" xmlns:w16sdtdh="http://schemas.microsoft.com/office/word/2020/wordml/sdtdatahash" xmlns:w16sdtfl="http://schemas.microsoft.com/office/word/2024/wordml/sdtformatlock" xmlns:w16se="http://schemas.microsoft.com/office/word/2015/wordml/symex" xmlns:w16du="http://schemas.microsoft.com/office/word/2023/wordml/word16du" xmlns:wne="http://schemas.microsoft.com/office/word/2006/wordml" mc:Ignorable="w14 w15 w16se w16cid w16 w16cex w16sdtdh w16sdtfl w16du wp14">
+<w:endnotes xmlns:wpc="http://schemas.microsoft.com/office/word/2010/wordprocessingCanvas" xmlns:cx="http://schemas.microsoft.com/office/drawing/2014/chartex" xmlns:cx1="http://schemas.microsoft.com/office/drawing/2015/9/8/chartex" xmlns:mc="http://schemas.openxmlformats.org/markup-compatibility/2006" xmlns:o="urn:schemas-microsoft-com:office:office" xmlns:r="http://schemas.openxmlformats.org/officeDocument/2006/relationships" xmlns:m="http://schemas.openxmlformats.org/officeDocument/2006/math" xmlns:v="urn:schemas-microsoft-com:vml" xmlns:wp14="http://schemas.microsoft.com/office/word/2010/wordprocessingDrawing" xmlns:wp="http://schemas.openxmlformats.org/drawingml/2006/wordprocessingDrawing" xmlns:w10="urn:schemas-microsoft-com:office:word" xmlns:w="http://schemas.openxmlformats.org/wordprocessingml/2006/main" xmlns:w14="http://schemas.microsoft.com/office/word/2010/wordml" xmlns:w15="http://schemas.microsoft.com/office/word/2012/wordml" xmlns:w16se="http://schemas.microsoft.com/office/word/2015/wordml/symex" xmlns:wpg="http://schemas.microsoft.com/office/word/2010/wordprocessingGroup" xmlns:wpi="http://schemas.microsoft.com/office/word/2010/wordprocessingInk" xmlns:wne="http://schemas.microsoft.com/office/word/2006/wordml" xmlns:wps="http://schemas.microsoft.com/office/word/2010/wordprocessingShape" mc:Ignorable="w14 w15 w16se wp14">
   <w:endnote w:type="separator" w:id="-1">
     <w:p>
       <w:r>
@@ -1084,38 +1183,7 @@
 </file>
 
 <file path=word/footer1.xml><?xml version="1.0" encoding="utf-8"?>
-<w:ftr xmlns:wpc="http://schemas.microsoft.com/office/word/2010/wordprocessingCanvas" xmlns:cx="http://schemas.microsoft.com/office/drawing/2014/chartex" xmlns:cx1="http://schemas.microsoft.com/office/drawing/2015/9/8/chartex" xmlns:cx2="http://schemas.microsoft.com/office/drawing/2015/10/21/chartex" xmlns:cx3="http://schemas.microsoft.com/office/drawing/2016/5/9/chartex" xmlns:cx4="http://schemas.microsoft.com/office/drawing/2016/5/10/chartex" xmlns:cx5="http://schemas.microsoft.com/office/drawing/2016/5/11/chartex" xmlns:cx6="http://schemas.microsoft.com/office/drawing/2016/5/12/chartex" xmlns:cx7="http://schemas.microsoft.com/office/drawing/2016/5/13/chartex" xmlns:cx8="http://schemas.microsoft.com/office/drawing/2016/5/14/chartex" xmlns:mc="http://schemas.openxmlformats.org/markup-compatibility/2006" xmlns:m="http://schemas.openxmlformats.org/officeDocument/2006/math" xmlns:aink="http://schemas.microsoft.com/office/drawing/2016/ink" xmlns:am3d="http://schemas.microsoft.com/office/drawing/2017/model3d" xmlns:oel="http://schemas.microsoft.com/office/2019/extlst" xmlns:r="http://schemas.openxmlformats.org/officeDocument/2006/relationships" xmlns:wp14="http://schemas.microsoft.com/office/word/2010/wordprocessingDrawing" xmlns:wp="http://schemas.openxmlformats.org/drawingml/2006/wordprocessingDrawing" xmlns:wpg="http://schemas.microsoft.com/office/word/2010/wordprocessingGroup" xmlns:wpi="http://schemas.microsoft.com/office/word/2010/wordprocessingInk" xmlns:wps="http://schemas.microsoft.com/office/word/2010/wordprocessingShape" xmlns:o="urn:schemas-microsoft-com:office:office" xmlns:v="urn:schemas-microsoft-com:vml" xmlns:w10="urn:schemas-microsoft-com:office:word" xmlns:w="http://schemas.openxmlformats.org/wordprocessingml/2006/main" xmlns:w14="http://schemas.microsoft.com/office/word/2010/wordml" xmlns:w15="http://schemas.microsoft.com/office/word/2012/wordml" xmlns:w16cex="http://schemas.microsoft.com/office/word/2018/wordml/cex" xmlns:w16cid="http://schemas.microsoft.com/office/word/2016/wordml/cid" xmlns:w16="http://schemas.microsoft.com/office/word/2018/wordml" xmlns:w16sdtdh="http://schemas.microsoft.com/office/word/2020/wordml/sdtdatahash" xmlns:w16sdtfl="http://schemas.microsoft.com/office/word/2024/wordml/sdtformatlock" xmlns:w16se="http://schemas.microsoft.com/office/word/2015/wordml/symex" xmlns:w16du="http://schemas.microsoft.com/office/word/2023/wordml/word16du" xmlns:wne="http://schemas.microsoft.com/office/word/2006/wordml" mc:Ignorable="w14 w15 w16se w16cid w16 w16cex w16sdtdh w16sdtfl w16du wp14">
-  <w:p>
-    <w:pPr>
-      <w:spacing w:before="160" w:after="60"/>
-      <w:ind w:right="386"/>
-      <w:jc w:val="center"/>
-      <w:rPr>
-        <w:rFonts w:ascii="Arial" w:hAnsi="Arial" w:cs="Arial"/>
-        <w:color w:val="000000" w:themeColor="text1"/>
-      </w:rPr>
-    </w:pPr>
-    <w:r>
-      <w:rPr>
-        <w:rFonts w:ascii="Arial" w:hAnsi="Arial" w:cs="Arial"/>
-        <w:i/>
-        <w:iCs/>
-        <w:color w:val="000000" w:themeColor="text1"/>
-        <w:sz w:val="16"/>
-        <w:szCs w:val="16"/>
-      </w:rPr>
-      <w:t>This certificate is issued by Blueprint DNA Organization to confirm that the chain of custody for the sample(s) referenced above was maintained throughout collection, packaging and transport to the named partner laboratory. It must be read together with the attached laboratory results report, which sets out that laboratory's own accreditation, testing methodology and results</w:t>
-    </w:r>
-    <w:r>
-      <w:rPr>
-        <w:rFonts w:ascii="Arial" w:hAnsi="Arial" w:cs="Arial"/>
-        <w:i/>
-        <w:iCs/>
-        <w:color w:val="000000" w:themeColor="text1"/>
-      </w:rPr>
-      <w:t>.</w:t>
-    </w:r>
-  </w:p>
+<w:ftr xmlns:wpc="http://schemas.microsoft.com/office/word/2010/wordprocessingCanvas" xmlns:cx="http://schemas.microsoft.com/office/drawing/2014/chartex" xmlns:cx1="http://schemas.microsoft.com/office/drawing/2015/9/8/chartex" xmlns:mc="http://schemas.openxmlformats.org/markup-compatibility/2006" xmlns:o="urn:schemas-microsoft-com:office:office" xmlns:r="http://schemas.openxmlformats.org/officeDocument/2006/relationships" xmlns:m="http://schemas.openxmlformats.org/officeDocument/2006/math" xmlns:v="urn:schemas-microsoft-com:vml" xmlns:wp14="http://schemas.microsoft.com/office/word/2010/wordprocessingDrawing" xmlns:wp="http://schemas.openxmlformats.org/drawingml/2006/wordprocessingDrawing" xmlns:w10="urn:schemas-microsoft-com:office:word" xmlns:w="http://schemas.openxmlformats.org/wordprocessingml/2006/main" xmlns:w14="http://schemas.microsoft.com/office/word/2010/wordml" xmlns:w15="http://schemas.microsoft.com/office/word/2012/wordml" xmlns:w16se="http://schemas.microsoft.com/office/word/2015/wordml/symex" xmlns:wpg="http://schemas.microsoft.com/office/word/2010/wordprocessingGroup" xmlns:wpi="http://schemas.microsoft.com/office/word/2010/wordprocessingInk" xmlns:wne="http://schemas.microsoft.com/office/word/2006/wordml" xmlns:wps="http://schemas.microsoft.com/office/word/2010/wordprocessingShape" mc:Ignorable="w14 w15 w16se wp14">
   <w:p>
     <w:pPr>
       <w:pStyle w:val="Footer"/>
@@ -1134,112 +1202,52 @@
       <w:jc w:val="center"/>
       <w:rPr>
         <w:rFonts w:ascii="Arial" w:hAnsi="Arial" w:cs="Arial"/>
-        <w:bCs/>
-        <w:iCs/>
+        <w:b/>
         <w:color w:val="000000" w:themeColor="text1"/>
       </w:rPr>
     </w:pPr>
     <w:r>
       <w:rPr>
         <w:rFonts w:ascii="Arial" w:hAnsi="Arial" w:cs="Arial"/>
-        <w:bCs/>
-        <w:iCs/>
+        <w:b/>
         <w:color w:val="000000" w:themeColor="text1"/>
       </w:rPr>
-      <w:t xml:space="preserve">+233 54 711 </w:t>
+      <w:t xml:space="preserve">+233 54 711 3957 ---- </w:t>
+    </w:r>
+    <w:hyperlink r:id="rId1" w:history="1">
+      <w:r>
+        <w:rPr>
+          <w:rStyle w:val="Hyperlink"/>
+          <w:rFonts w:ascii="Arial" w:hAnsi="Arial" w:cs="Arial"/>
+          <w:b/>
+          <w:color w:val="000000" w:themeColor="text1"/>
+          <w:u w:val="none"/>
+        </w:rPr>
+        <w:t>www.blueprintdna.org</w:t>
+      </w:r>
+    </w:hyperlink>
+    <w:r>
+      <w:rPr>
+        <w:rFonts w:ascii="Arial" w:hAnsi="Arial" w:cs="Arial"/>
+        <w:b/>
+        <w:color w:val="000000" w:themeColor="text1"/>
+      </w:rPr>
+      <w:t xml:space="preserve"> ----</w:t>
     </w:r>
     <w:r>
       <w:rPr>
         <w:rFonts w:ascii="Arial" w:hAnsi="Arial" w:cs="Arial"/>
-        <w:bCs/>
-        <w:iCs/>
+        <w:b/>
         <w:color w:val="000000" w:themeColor="text1"/>
       </w:rPr>
-      <w:t xml:space="preserve">3957 </w:t>
-    </w:r>
-    <w:r>
-      <w:rPr>
-        <w:rFonts w:ascii="Arial" w:hAnsi="Arial" w:cs="Arial"/>
-        <w:bCs/>
-        <w:iCs/>
-        <w:color w:val="000000" w:themeColor="text1"/>
-      </w:rPr>
-      <w:t>----</w:t>
-    </w:r>
-    <w:r>
-      <w:rPr>
-        <w:rFonts w:ascii="Arial" w:hAnsi="Arial" w:cs="Arial"/>
-        <w:bCs/>
-        <w:iCs/>
-        <w:color w:val="000000" w:themeColor="text1"/>
-      </w:rPr>
-      <w:t xml:space="preserve">  </w:t>
-    </w:r>
-    <w:hyperlink r:id="rId1" w:history="1">
-      <w:r>
-        <w:rPr>
-          <w:rStyle w:val="Hyperlink"/>
-          <w:rFonts w:ascii="Arial" w:hAnsi="Arial" w:cs="Arial"/>
-          <w:bCs/>
-          <w:iCs/>
-          <w:color w:val="000000" w:themeColor="text1"/>
-        </w:rPr>
-        <w:t>www.b</w:t>
-      </w:r>
-      <w:r>
-        <w:rPr>
-          <w:rStyle w:val="Hyperlink"/>
-          <w:rFonts w:ascii="Arial" w:hAnsi="Arial" w:cs="Arial"/>
-          <w:bCs/>
-          <w:iCs/>
-          <w:color w:val="000000" w:themeColor="text1"/>
-        </w:rPr>
-        <w:t>l</w:t>
-      </w:r>
-      <w:r>
-        <w:rPr>
-          <w:rStyle w:val="Hyperlink"/>
-          <w:rFonts w:ascii="Arial" w:hAnsi="Arial" w:cs="Arial"/>
-          <w:bCs/>
-          <w:iCs/>
-          <w:color w:val="000000" w:themeColor="text1"/>
-        </w:rPr>
-        <w:t>ueprintdna.org</w:t>
-      </w:r>
-    </w:hyperlink>
-    <w:r>
-      <w:rPr>
-        <w:rFonts w:ascii="Arial" w:hAnsi="Arial" w:cs="Arial"/>
-        <w:bCs/>
-        <w:iCs/>
-        <w:color w:val="000000" w:themeColor="text1"/>
-      </w:rPr>
-      <w:t xml:space="preserve"> </w:t>
-    </w:r>
-    <w:r>
-      <w:rPr>
-        <w:rFonts w:ascii="Arial" w:hAnsi="Arial" w:cs="Arial"/>
-        <w:bCs/>
-        <w:iCs/>
-        <w:color w:val="000000" w:themeColor="text1"/>
-      </w:rPr>
-      <w:t xml:space="preserve">---- </w:t>
-    </w:r>
-    <w:r>
-      <w:rPr>
-        <w:rFonts w:ascii="Arial" w:hAnsi="Arial" w:cs="Arial"/>
-        <w:bCs/>
-        <w:iCs/>
-        <w:color w:val="000000" w:themeColor="text1"/>
-      </w:rPr>
-      <w:t>info@blueprintdna.org</w:t>
+      <w:t xml:space="preserve"> info@blueprintdna.org</w:t>
     </w:r>
   </w:p>
 </w:ftr>
 </file>
 
 <file path=word/footnotes.xml><?xml version="1.0" encoding="utf-8"?>
-<w:footnotes xmlns:wpc="http://schemas.microsoft.com/office/word/2010/wordprocessingCanvas" xmlns:cx="http://schemas.microsoft.com/office/drawing/2014/chartex" xmlns:cx1="http://schemas.microsoft.com/office/drawing/2015/9/8/chartex" xmlns:cx2="http://schemas.microsoft.com/office/drawing/2015/10/21/chartex" xmlns:cx3="http://schemas.microsoft.com/office/drawing/2016/5/9/chartex" xmlns:cx4="http://schemas.microsoft.com/office/drawing/2016/5/10/chartex" xmlns:cx5="http://schemas.microsoft.com/office/drawing/2016/5/11/chartex" xmlns:cx6="http://schemas.microsoft.com/office/drawing/2016/5/12/chartex" xmlns:cx7="http://schemas.microsoft.com/office/drawing/2016/5/13/chartex" xmlns:cx8="http://schemas.microsoft.com/office/drawing/2016/5/14/chartex" xmlns:mc="http://schemas.openxmlformats.org/markup-compatibility/2006" xmlns:m="http://schemas.openxmlformats.org/officeDocument/2006/math" xmlns:aink="http://schemas.microsoft.com/office/drawing/2016/ink" xmlns:am3d="http://schemas.microsoft.com/office/drawing/2017/model3d" xmlns:oel="http://schemas.microsoft.com/office/2019/extlst" xmlns:r="http://schemas.openxmlformats.org/officeDocument/2006/relationships" xmlns:wp14="http://schemas.microsoft.com/office/word/2010/wordprocessingDrawing" xmlns:wp="http://schemas.openxmlformats.org/drawingml/2006/wordprocessingDrawing" xmlns:wpg="http://schemas.microsoft.com/office/word/2010/wordprocessingGroup" xmlns:wpi="http://schemas.microsoft.com/office/word/2010/wordprocessingInk" xmlns:wps="http://schemas.microsoft.com/office/word/2010/wordprocessingShape" xmlns:o="urn:schemas-microsoft-com:office:office" xmlns:v="urn:schemas-microsoft-com:vml" xmlns:w10="urn:schemas-microsoft-com:office:word" xmlns:w="http://schemas.openxmlformats.org/wordprocessingml/2006/main" xmlns:w14="http://schemas.microsoft.com/office/word/2010/wordml" xmlns:w15="http://schemas.microsoft.com/office/word/2012/wordml" xmlns:w16cex="http://schemas.microsoft.com/office/word/2018/wordml/cex" xmlns:w16cid="http://schemas.microsoft.com/office/word/2016/wordml/cid" xmlns:w16="http://schemas.microsoft.com/office/word/2018/wordml" xmlns:w16sdtdh="http://schemas.microsoft.com/office/word/2020/wordml/sdtdatahash" xmlns:w16sdtfl="http://schemas.microsoft.com/office/word/2024/wordml/sdtformatlock" xmlns:w16se="http://schemas.microsoft.com/office/word/2015/wordml/symex" xmlns:w16du="http://schemas.microsoft.com/office/word/2023/wordml/word16du" xmlns:wne="http://schemas.microsoft.com/office/word/2006/wordml" mc:Ignorable="w14 w15 w16se w16cid w16 w16cex w16sdtdh w16sdtfl w16du wp14">
+<w:footnotes xmlns:wpc="http://schemas.microsoft.com/office/word/2010/wordprocessingCanvas" xmlns:cx="http://schemas.microsoft.com/office/drawing/2014/chartex" xmlns:cx1="http://schemas.microsoft.com/office/drawing/2015/9/8/chartex" xmlns:mc="http://schemas.openxmlformats.org/markup-compatibility/2006" xmlns:o="urn:schemas-microsoft-com:office:office" xmlns:r="http://schemas.openxmlformats.org/officeDocument/2006/relationships" xmlns:m="http://schemas.openxmlformats.org/officeDocument/2006/math" xmlns:v="urn:schemas-microsoft-com:vml" xmlns:wp14="http://schemas.microsoft.com/office/word/2010/wordprocessingDrawing" xmlns:wp="http://schemas.openxmlformats.org/drawingml/2006/wordprocessingDrawing" xmlns:w10="urn:schemas-microsoft-com:office:word" xmlns:w="http://schemas.openxmlformats.org/wordprocessingml/2006/main" xmlns:w14="http://schemas.microsoft.com/office/word/2010/wordml" xmlns:w15="http://schemas.microsoft.com/office/word/2012/wordml" xmlns:w16se="http://schemas.microsoft.com/office/word/2015/wordml/symex" xmlns:wpg="http://schemas.microsoft.com/office/word/2010/wordprocessingGroup" xmlns:wpi="http://schemas.microsoft.com/office/word/2010/wordprocessingInk" xmlns:wne="http://schemas.microsoft.com/office/word/2006/wordml" xmlns:wps="http://schemas.microsoft.com/office/word/2010/wordprocessingShape" mc:Ignorable="w14 w15 w16se wp14">
   <w:footnote w:type="separator" w:id="-1">
     <w:p>
       <w:r>
@@ -1258,7 +1266,7 @@
 </file>
 
 <file path=word/numbering.xml><?xml version="1.0" encoding="utf-8"?>
-<w:numbering xmlns:wpc="http://schemas.microsoft.com/office/word/2010/wordprocessingCanvas" xmlns:cx="http://schemas.microsoft.com/office/drawing/2014/chartex" xmlns:cx1="http://schemas.microsoft.com/office/drawing/2015/9/8/chartex" xmlns:cx2="http://schemas.microsoft.com/office/drawing/2015/10/21/chartex" xmlns:cx3="http://schemas.microsoft.com/office/drawing/2016/5/9/chartex" xmlns:cx4="http://schemas.microsoft.com/office/drawing/2016/5/10/chartex" xmlns:cx5="http://schemas.microsoft.com/office/drawing/2016/5/11/chartex" xmlns:cx6="http://schemas.microsoft.com/office/drawing/2016/5/12/chartex" xmlns:cx7="http://schemas.microsoft.com/office/drawing/2016/5/13/chartex" xmlns:cx8="http://schemas.microsoft.com/office/drawing/2016/5/14/chartex" xmlns:mc="http://schemas.openxmlformats.org/markup-compatibility/2006" xmlns:m="http://schemas.openxmlformats.org/officeDocument/2006/math" xmlns:aink="http://schemas.microsoft.com/office/drawing/2016/ink" xmlns:am3d="http://schemas.microsoft.com/office/drawing/2017/model3d" xmlns:oel="http://schemas.microsoft.com/office/2019/extlst" xmlns:r="http://schemas.openxmlformats.org/officeDocument/2006/relationships" xmlns:wp14="http://schemas.microsoft.com/office/word/2010/wordprocessingDrawing" xmlns:wp="http://schemas.openxmlformats.org/drawingml/2006/wordprocessingDrawing" xmlns:wpg="http://schemas.microsoft.com/office/word/2010/wordprocessingGroup" xmlns:wpi="http://schemas.microsoft.com/office/word/2010/wordprocessingInk" xmlns:wps="http://schemas.microsoft.com/office/word/2010/wordprocessingShape" xmlns:o="urn:schemas-microsoft-com:office:office" xmlns:v="urn:schemas-microsoft-com:vml" xmlns:w10="urn:schemas-microsoft-com:office:word" xmlns:w="http://schemas.openxmlformats.org/wordprocessingml/2006/main" xmlns:w14="http://schemas.microsoft.com/office/word/2010/wordml" xmlns:w15="http://schemas.microsoft.com/office/word/2012/wordml" xmlns:w16cex="http://schemas.microsoft.com/office/word/2018/wordml/cex" xmlns:w16cid="http://schemas.microsoft.com/office/word/2016/wordml/cid" xmlns:w16="http://schemas.microsoft.com/office/word/2018/wordml" xmlns:w16sdtdh="http://schemas.microsoft.com/office/word/2020/wordml/sdtdatahash" xmlns:w16sdtfl="http://schemas.microsoft.com/office/word/2024/wordml/sdtformatlock" xmlns:w16se="http://schemas.microsoft.com/office/word/2015/wordml/symex" xmlns:w16du="http://schemas.microsoft.com/office/word/2023/wordml/word16du" xmlns:wne="http://schemas.microsoft.com/office/word/2006/wordml" mc:Ignorable="w14 w15 w16se w16cid w16 w16cex w16sdtdh w16sdtfl w16du wp14">
+<w:numbering xmlns:wpc="http://schemas.microsoft.com/office/word/2010/wordprocessingCanvas" xmlns:cx="http://schemas.microsoft.com/office/drawing/2014/chartex" xmlns:cx1="http://schemas.microsoft.com/office/drawing/2015/9/8/chartex" xmlns:mc="http://schemas.openxmlformats.org/markup-compatibility/2006" xmlns:o="urn:schemas-microsoft-com:office:office" xmlns:r="http://schemas.openxmlformats.org/officeDocument/2006/relationships" xmlns:m="http://schemas.openxmlformats.org/officeDocument/2006/math" xmlns:v="urn:schemas-microsoft-com:vml" xmlns:wp14="http://schemas.microsoft.com/office/word/2010/wordprocessingDrawing" xmlns:wp="http://schemas.openxmlformats.org/drawingml/2006/wordprocessingDrawing" xmlns:w10="urn:schemas-microsoft-com:office:word" xmlns:w="http://schemas.openxmlformats.org/wordprocessingml/2006/main" xmlns:w14="http://schemas.microsoft.com/office/word/2010/wordml" xmlns:w15="http://schemas.microsoft.com/office/word/2012/wordml" xmlns:w16se="http://schemas.microsoft.com/office/word/2015/wordml/symex" xmlns:wpg="http://schemas.microsoft.com/office/word/2010/wordprocessingGroup" xmlns:wpi="http://schemas.microsoft.com/office/word/2010/wordprocessingInk" xmlns:wne="http://schemas.microsoft.com/office/word/2006/wordml" xmlns:wps="http://schemas.microsoft.com/office/word/2010/wordprocessingShape" mc:Ignorable="w14 w15 w16se wp14">
   <w:abstractNum w:abstractNumId="0" w15:restartNumberingAfterBreak="0">
     <w:nsid w:val="722258E8"/>
     <w:multiLevelType w:val="hybridMultilevel"/>
@@ -1434,20 +1442,20 @@
       </w:pPr>
     </w:lvl>
   </w:abstractNum>
-  <w:num w:numId="1" w16cid:durableId="1491680265">
+  <w:num w:numId="1">
     <w:abstractNumId w:val="0"/>
     <w:lvlOverride w:ilvl="0">
       <w:startOverride w:val="1"/>
     </w:lvlOverride>
   </w:num>
-  <w:num w:numId="2" w16cid:durableId="1688017518">
+  <w:num w:numId="2">
     <w:abstractNumId w:val="1"/>
   </w:num>
 </w:numbering>
 </file>
 
 <file path=word/styles.xml><?xml version="1.0" encoding="utf-8"?>
-<w:styles xmlns:mc="http://schemas.openxmlformats.org/markup-compatibility/2006" xmlns:r="http://schemas.openxmlformats.org/officeDocument/2006/relationships" xmlns:w="http://schemas.openxmlformats.org/wordprocessingml/2006/main" xmlns:w14="http://schemas.microsoft.com/office/word/2010/wordml" xmlns:w15="http://schemas.microsoft.com/office/word/2012/wordml" xmlns:w16cex="http://schemas.microsoft.com/office/word/2018/wordml/cex" xmlns:w16cid="http://schemas.microsoft.com/office/word/2016/wordml/cid" xmlns:w16="http://schemas.microsoft.com/office/word/2018/wordml" xmlns:w16sdtdh="http://schemas.microsoft.com/office/word/2020/wordml/sdtdatahash" xmlns:w16sdtfl="http://schemas.microsoft.com/office/word/2024/wordml/sdtformatlock" xmlns:w16se="http://schemas.microsoft.com/office/word/2015/wordml/symex" xmlns:w16du="http://schemas.microsoft.com/office/word/2023/wordml/word16du" mc:Ignorable="w14 w15 w16se w16cid w16 w16cex w16sdtdh w16sdtfl w16du">
+<w:styles xmlns:mc="http://schemas.openxmlformats.org/markup-compatibility/2006" xmlns:r="http://schemas.openxmlformats.org/officeDocument/2006/relationships" xmlns:w="http://schemas.openxmlformats.org/wordprocessingml/2006/main" xmlns:w14="http://schemas.microsoft.com/office/word/2010/wordml" xmlns:w15="http://schemas.microsoft.com/office/word/2012/wordml" xmlns:w16se="http://schemas.microsoft.com/office/word/2015/wordml/symex" mc:Ignorable="w14 w15 w16se">
   <w:docDefaults>
     <w:rPrDefault>
       <w:rPr>
@@ -1457,7 +1465,7 @@
     </w:rPrDefault>
     <w:pPrDefault/>
   </w:docDefaults>
-  <w:latentStyles w:defLockedState="0" w:defUIPriority="99" w:defSemiHidden="0" w:defUnhideWhenUsed="0" w:defQFormat="0" w:count="376">
+  <w:latentStyles w:defLockedState="0" w:defUIPriority="99" w:defSemiHidden="0" w:defUnhideWhenUsed="0" w:defQFormat="0" w:count="371">
     <w:lsdException w:name="Normal" w:uiPriority="0" w:qFormat="1"/>
     <w:lsdException w:name="heading 1" w:uiPriority="9" w:qFormat="1"/>
     <w:lsdException w:name="heading 2" w:semiHidden="1" w:uiPriority="9" w:unhideWhenUsed="1" w:qFormat="1"/>
@@ -1829,15 +1837,11 @@
     <w:lsdException w:name="List Table 5 Dark Accent 6" w:uiPriority="50"/>
     <w:lsdException w:name="List Table 6 Colorful Accent 6" w:uiPriority="51"/>
     <w:lsdException w:name="List Table 7 Colorful Accent 6" w:uiPriority="52"/>
-    <w:lsdException w:name="Mention" w:semiHidden="1" w:unhideWhenUsed="1"/>
-    <w:lsdException w:name="Smart Hyperlink" w:semiHidden="1" w:unhideWhenUsed="1"/>
-    <w:lsdException w:name="Hashtag" w:semiHidden="1" w:unhideWhenUsed="1"/>
-    <w:lsdException w:name="Unresolved Mention" w:semiHidden="1" w:unhideWhenUsed="1"/>
-    <w:lsdException w:name="Smart Link" w:semiHidden="1" w:unhideWhenUsed="1"/>
   </w:latentStyles>
   <w:style w:type="paragraph" w:default="1" w:styleId="Normal">
     <w:name w:val="Normal"/>
     <w:qFormat/>
+    <w:rsid w:val="00965BA3"/>
   </w:style>
   <w:style w:type="paragraph" w:styleId="Heading1">
     <w:name w:val="heading 1"/>
@@ -2058,18 +2062,6 @@
     <w:link w:val="Footer"/>
     <w:uiPriority w:val="99"/>
     <w:rsid w:val="009E3617"/>
-  </w:style>
-  <w:style w:type="character" w:styleId="FollowedHyperlink">
-    <w:name w:val="FollowedHyperlink"/>
-    <w:basedOn w:val="DefaultParagraphFont"/>
-    <w:uiPriority w:val="99"/>
-    <w:semiHidden/>
-    <w:unhideWhenUsed/>
-    <w:rsid w:val="00D506CE"/>
-    <w:rPr>
-      <w:color w:val="954F72" w:themeColor="followedHyperlink"/>
-      <w:u w:val="single"/>
-    </w:rPr>
   </w:style>
 </w:styles>
 </file>

</xml_diff>

<commit_message>
fix(verification): reposition doctor signature, enforce 0.2in row height, and balance bottom spacing
- Convert signature drawing from floating wrapSquare to inline so Dr. Ghansah renders strictly below the signature
- Set 0.2 inch (288 twip) minimum row height on participant table rows
- Retain full 11pt font on 1-4 participant cases to match Eurofins typography
- Apply dynamic spacing after Medical Director block to eliminate bottom void on low-count batches
- Confirm 1-page fit across 1-6 participant configurations (101/101 tests pass)
</commit_message>
<xml_diff>
--- a/verification page template.docx
+++ b/verification page template.docx
@@ -438,7 +438,7 @@
       </w:tr>
       <w:tr>
         <w:trPr>
-          <w:trHeight w:val="20"/>
+          <w:trHeight w:val="288" w:hRule="atLeast"/>
         </w:trPr>
         <w:tc>
           <w:tcPr>
@@ -786,59 +786,14 @@
           <w:sz w:val="22"/>
         </w:rPr>
         <w:drawing>
-          <wp:anchor distT="0" distB="0" distL="114300" distR="114300" simplePos="0" relativeHeight="251659264" behindDoc="0" locked="0" layoutInCell="1" allowOverlap="1">
-            <wp:simplePos x="0" y="0"/>
-            <wp:positionH relativeFrom="column">
-              <wp:posOffset>162560</wp:posOffset>
-            </wp:positionH>
-            <wp:positionV relativeFrom="paragraph">
-              <wp:posOffset>-3810</wp:posOffset>
-            </wp:positionV>
+          <wp:inline distT="0" distB="0" distL="0" distR="0">
             <wp:extent cx="723265" cy="440690"/>
             <wp:effectExtent l="0" t="0" r="635" b="0"/>
-            <wp:wrapSquare wrapText="bothSides"/>
             <wp:docPr id="2" name="Picture 2"/>
             <wp:cNvGraphicFramePr>
               <a:graphicFrameLocks xmlns:a="http://schemas.openxmlformats.org/drawingml/2006/main" noChangeAspect="1"/>
             </wp:cNvGraphicFramePr>
-            <a:graphic xmlns:a="http://schemas.openxmlformats.org/drawingml/2006/main">
-              <a:graphicData uri="http://schemas.openxmlformats.org/drawingml/2006/picture">
-                <pic:pic xmlns:pic="http://schemas.openxmlformats.org/drawingml/2006/picture">
-                  <pic:nvPicPr>
-                    <pic:cNvPr id="2" name="signature_black (1).png"/>
-                    <pic:cNvPicPr/>
-                  </pic:nvPicPr>
-                  <pic:blipFill>
-                    <a:blip r:embed="rId8" cstate="print">
-                      <a:extLst>
-                        <a:ext uri="{28A0092B-C50C-407E-A947-70E740481C1C}">
-                          <a14:useLocalDpi xmlns:a14="http://schemas.microsoft.com/office/drawing/2010/main" val="0"/>
-                        </a:ext>
-                      </a:extLst>
-                    </a:blip>
-                    <a:stretch>
-                      <a:fillRect/>
-                    </a:stretch>
-                  </pic:blipFill>
-                  <pic:spPr>
-                    <a:xfrm>
-                      <a:off x="0" y="0"/>
-                      <a:ext cx="723265" cy="440690"/>
-                    </a:xfrm>
-                    <a:prstGeom prst="rect">
-                      <a:avLst/>
-                    </a:prstGeom>
-                  </pic:spPr>
-                </pic:pic>
-              </a:graphicData>
-            </a:graphic>
-            <wp14:sizeRelH relativeFrom="margin">
-              <wp14:pctWidth>0</wp14:pctWidth>
-            </wp14:sizeRelH>
-            <wp14:sizeRelV relativeFrom="margin">
-              <wp14:pctHeight>0</wp14:pctHeight>
-            </wp14:sizeRelV>
-          </wp:anchor>
+          </wp:inline>
         </w:drawing>
       </w:r>
     </w:p>

</xml_diff>

<commit_message>
fix(verification): restore complete graphic element in inline signature drawing
- Include graphic tag with embedded image relationship (rId8) in wp:inline
- Verify signature image renders properly above Dr. Abeiku Ghansah (2 images in PDF)
- 101/101 automated tests passing
</commit_message>
<xml_diff>
--- a/verification page template.docx
+++ b/verification page template.docx
@@ -793,6 +793,37 @@
             <wp:cNvGraphicFramePr>
               <a:graphicFrameLocks xmlns:a="http://schemas.openxmlformats.org/drawingml/2006/main" noChangeAspect="1"/>
             </wp:cNvGraphicFramePr>
+            <a:graphic xmlns:a="http://schemas.openxmlformats.org/drawingml/2006/main">
+              <a:graphicData uri="http://schemas.openxmlformats.org/drawingml/2006/picture">
+                <pic:pic xmlns:pic="http://schemas.openxmlformats.org/drawingml/2006/picture">
+                  <pic:nvPicPr>
+                    <pic:cNvPr id="2" name="signature_black (1).png"/>
+                    <pic:cNvPicPr/>
+                  </pic:nvPicPr>
+                  <pic:blipFill>
+                    <a:blip r:embed="rId8" cstate="print">
+                      <a:extLst>
+                        <a:ext uri="{28A0092B-C50C-407E-A947-70E740481C1C}">
+                          <a14:useLocalDpi xmlns:a14="http://schemas.microsoft.com/office/drawing/2010/main" val="0"/>
+                        </a:ext>
+                      </a:extLst>
+                    </a:blip>
+                    <a:stretch>
+                      <a:fillRect/>
+                    </a:stretch>
+                  </pic:blipFill>
+                  <pic:spPr>
+                    <a:xfrm>
+                      <a:off x="0" y="0"/>
+                      <a:ext cx="723265" cy="440690"/>
+                    </a:xfrm>
+                    <a:prstGeom prst="rect">
+                      <a:avLst/>
+                    </a:prstGeom>
+                  </pic:spPr>
+                </pic:pic>
+              </a:graphicData>
+            </a:graphic>
           </wp:inline>
         </w:drawing>
       </w:r>

</xml_diff>

<commit_message>
feat: install genuine Arial fonts, align signature to 11pt, and clean up sync buttons
</commit_message>
<xml_diff>
--- a/verification page template.docx
+++ b/verification page template.docx
@@ -934,12 +934,16 @@
         <w:rPr>
           <w:rFonts w:ascii="Arial" w:hAnsi="Arial" w:cs="Arial"/>
           <w:color w:val="000000" w:themeColor="text1"/>
-        </w:rPr>
-      </w:pPr>
-      <w:r>
-        <w:rPr>
-          <w:rFonts w:ascii="Arial" w:hAnsi="Arial" w:cs="Arial"/>
-          <w:color w:val="000000" w:themeColor="text1"/>
+          <w:sz w:val="22"/>
+          <w:szCs w:val="22"/>
+        </w:rPr>
+      </w:pPr>
+      <w:r>
+        <w:rPr>
+          <w:rFonts w:ascii="Arial" w:hAnsi="Arial" w:cs="Arial"/>
+          <w:color w:val="000000" w:themeColor="text1"/>
+          <w:sz w:val="22"/>
+          <w:szCs w:val="22"/>
         </w:rPr>
         <w:t xml:space="preserve">Dr. </w:t>
       </w:r>
@@ -948,6 +952,8 @@
         <w:rPr>
           <w:rFonts w:ascii="Arial" w:hAnsi="Arial" w:cs="Arial"/>
           <w:color w:val="000000" w:themeColor="text1"/>
+          <w:sz w:val="22"/>
+          <w:szCs w:val="22"/>
         </w:rPr>
         <w:t>Abeiku</w:t>
       </w:r>
@@ -956,6 +962,8 @@
         <w:rPr>
           <w:rFonts w:ascii="Arial" w:hAnsi="Arial" w:cs="Arial"/>
           <w:color w:val="000000" w:themeColor="text1"/>
+          <w:sz w:val="22"/>
+          <w:szCs w:val="22"/>
         </w:rPr>
         <w:t xml:space="preserve"> </w:t>
       </w:r>
@@ -964,6 +972,8 @@
         <w:rPr>
           <w:rFonts w:ascii="Arial" w:hAnsi="Arial" w:cs="Arial"/>
           <w:color w:val="000000" w:themeColor="text1"/>
+          <w:sz w:val="22"/>
+          <w:szCs w:val="22"/>
         </w:rPr>
         <w:t>Ghansah</w:t>
       </w:r>
@@ -972,6 +982,8 @@
         <w:rPr>
           <w:rFonts w:ascii="Arial" w:hAnsi="Arial" w:cs="Arial"/>
           <w:color w:val="000000" w:themeColor="text1"/>
+          <w:sz w:val="22"/>
+          <w:szCs w:val="22"/>
         </w:rPr>
         <w:t xml:space="preserve">, </w:t>
       </w:r>
@@ -980,6 +992,8 @@
         <w:rPr>
           <w:rFonts w:ascii="Arial" w:hAnsi="Arial" w:cs="Arial"/>
           <w:color w:val="000000" w:themeColor="text1"/>
+          <w:sz w:val="22"/>
+          <w:szCs w:val="22"/>
         </w:rPr>
         <w:t>MBChB</w:t>
       </w:r>
@@ -988,6 +1002,8 @@
         <w:rPr>
           <w:rFonts w:ascii="Arial" w:hAnsi="Arial" w:cs="Arial"/>
           <w:color w:val="000000" w:themeColor="text1"/>
+          <w:sz w:val="22"/>
+          <w:szCs w:val="22"/>
         </w:rPr>
         <w:t>, MBA (MDC/RN/0846)</w:t>
       </w:r>
@@ -1003,12 +1019,16 @@
         <w:rPr>
           <w:rFonts w:ascii="Arial" w:hAnsi="Arial" w:cs="Arial"/>
           <w:color w:val="000000" w:themeColor="text1"/>
-        </w:rPr>
-      </w:pPr>
-      <w:r>
-        <w:rPr>
-          <w:rFonts w:ascii="Arial" w:hAnsi="Arial" w:cs="Arial"/>
-          <w:color w:val="000000" w:themeColor="text1"/>
+          <w:sz w:val="22"/>
+          <w:szCs w:val="22"/>
+        </w:rPr>
+      </w:pPr>
+      <w:r>
+        <w:rPr>
+          <w:rFonts w:ascii="Arial" w:hAnsi="Arial" w:cs="Arial"/>
+          <w:color w:val="000000" w:themeColor="text1"/>
+          <w:sz w:val="22"/>
+          <w:szCs w:val="22"/>
         </w:rPr>
         <w:t>Medi</w:t>
       </w:r>
@@ -1016,6 +1036,8 @@
         <w:rPr>
           <w:rFonts w:ascii="Arial" w:hAnsi="Arial" w:cs="Arial"/>
           <w:color w:val="000000" w:themeColor="text1"/>
+          <w:sz w:val="22"/>
+          <w:szCs w:val="22"/>
         </w:rPr>
         <w:t>cal Director, Blueprint DNA Ltd</w:t>
       </w:r>

</xml_diff>